<commit_message>
admin follow-up: privacy policy, missing fx quotes, SAD v2.1
</commit_message>
<xml_diff>
--- a/docs/SAD.docx
+++ b/docs/SAD.docx
@@ -33,7 +33,7 @@
           <w:sz w:val="36"/>
           <w:szCs w:val="36"/>
         </w:rPr>
-        <w:t xml:space="preserve">(SAD) – Version 2.0</w:t>
+        <w:t xml:space="preserve">(SAD) – Version 2.1</w:t>
       </w:r>
     </w:p>
     <w:p>
@@ -319,7 +319,7 @@
                 <w:sz w:val="19"/>
                 <w:szCs w:val="19"/>
               </w:rPr>
-              <w:t xml:space="preserve">2.0 — as-built architecture</w:t>
+              <w:t xml:space="preserve">2.1 — as-built architecture</w:t>
             </w:r>
           </w:p>
         </w:tc>
@@ -382,7 +382,7 @@
                 <w:sz w:val="19"/>
                 <w:szCs w:val="19"/>
               </w:rPr>
-              <w:t xml:space="preserve">27 October 2026</w:t>
+              <w:t xml:space="preserve">28 October 2026</w:t>
             </w:r>
           </w:p>
         </w:tc>
@@ -445,7 +445,7 @@
                 <w:sz w:val="19"/>
                 <w:szCs w:val="19"/>
               </w:rPr>
-              <w:t xml:space="preserve">Current. Describes the system as it runs after roadmap phases 0–6h</w:t>
+              <w:t xml:space="preserve">Current. Describes the system as it runs after roadmap phases 0–6h and the admin dashboard</w:t>
             </w:r>
           </w:p>
         </w:tc>
@@ -1047,6 +1047,127 @@
           </w:p>
         </w:tc>
       </w:tr>
+      <w:tr>
+        <w:trPr>
+          <w:cantSplit/>
+        </w:trPr>
+        <w:tc>
+          <w:tcPr>
+            <w:tcW w:type="dxa" w:w="963"/>
+            <w:tcBorders>
+              <w:top w:val="single" w:color="9FB6CD" w:sz="4"/>
+              <w:left w:val="single" w:color="9FB6CD" w:sz="4"/>
+              <w:bottom w:val="single" w:color="9FB6CD" w:sz="4"/>
+              <w:right w:val="single" w:color="9FB6CD" w:sz="4"/>
+            </w:tcBorders>
+            <w:tcMar>
+              <w:top w:type="dxa" w:w="60"/>
+              <w:left w:type="dxa" w:w="100"/>
+              <w:bottom w:type="dxa" w:w="60"/>
+              <w:right w:type="dxa" w:w="100"/>
+            </w:tcMar>
+          </w:tcPr>
+          <w:p>
+            <w:pPr>
+              <w:spacing w:after="0"/>
+            </w:pPr>
+            <w:r>
+              <w:rPr>
+                <w:sz w:val="19"/>
+                <w:szCs w:val="19"/>
+              </w:rPr>
+              <w:t xml:space="preserve">2.1</w:t>
+            </w:r>
+          </w:p>
+        </w:tc>
+        <w:tc>
+          <w:tcPr>
+            <w:tcW w:type="dxa" w:w="1325"/>
+            <w:tcBorders>
+              <w:top w:val="single" w:color="9FB6CD" w:sz="4"/>
+              <w:left w:val="single" w:color="9FB6CD" w:sz="4"/>
+              <w:bottom w:val="single" w:color="9FB6CD" w:sz="4"/>
+              <w:right w:val="single" w:color="9FB6CD" w:sz="4"/>
+            </w:tcBorders>
+            <w:tcMar>
+              <w:top w:type="dxa" w:w="60"/>
+              <w:left w:type="dxa" w:w="100"/>
+              <w:bottom w:type="dxa" w:w="60"/>
+              <w:right w:type="dxa" w:w="100"/>
+            </w:tcMar>
+          </w:tcPr>
+          <w:p>
+            <w:pPr>
+              <w:spacing w:after="0"/>
+            </w:pPr>
+            <w:r>
+              <w:rPr>
+                <w:sz w:val="19"/>
+                <w:szCs w:val="19"/>
+              </w:rPr>
+              <w:t xml:space="preserve">28 Oct 2026</w:t>
+            </w:r>
+          </w:p>
+        </w:tc>
+        <w:tc>
+          <w:tcPr>
+            <w:tcW w:type="dxa" w:w="1325"/>
+            <w:tcBorders>
+              <w:top w:val="single" w:color="9FB6CD" w:sz="4"/>
+              <w:left w:val="single" w:color="9FB6CD" w:sz="4"/>
+              <w:bottom w:val="single" w:color="9FB6CD" w:sz="4"/>
+              <w:right w:val="single" w:color="9FB6CD" w:sz="4"/>
+            </w:tcBorders>
+            <w:tcMar>
+              <w:top w:type="dxa" w:w="60"/>
+              <w:left w:type="dxa" w:w="100"/>
+              <w:bottom w:type="dxa" w:w="60"/>
+              <w:right w:type="dxa" w:w="100"/>
+            </w:tcMar>
+          </w:tcPr>
+          <w:p>
+            <w:pPr>
+              <w:spacing w:after="0"/>
+            </w:pPr>
+            <w:r>
+              <w:rPr>
+                <w:sz w:val="19"/>
+                <w:szCs w:val="19"/>
+              </w:rPr>
+              <w:t xml:space="preserve">M. Altaweel, R. Arslan</w:t>
+            </w:r>
+          </w:p>
+        </w:tc>
+        <w:tc>
+          <w:tcPr>
+            <w:tcW w:type="dxa" w:w="6025"/>
+            <w:tcBorders>
+              <w:top w:val="single" w:color="9FB6CD" w:sz="4"/>
+              <w:left w:val="single" w:color="9FB6CD" w:sz="4"/>
+              <w:bottom w:val="single" w:color="9FB6CD" w:sz="4"/>
+              <w:right w:val="single" w:color="9FB6CD" w:sz="4"/>
+            </w:tcBorders>
+            <w:tcMar>
+              <w:top w:type="dxa" w:w="60"/>
+              <w:left w:type="dxa" w:w="100"/>
+              <w:bottom w:type="dxa" w:w="60"/>
+              <w:right w:type="dxa" w:w="100"/>
+            </w:tcMar>
+          </w:tcPr>
+          <w:p>
+            <w:pPr>
+              <w:spacing w:after="0"/>
+            </w:pPr>
+            <w:r>
+              <w:rPr>
+                <w:sz w:val="19"/>
+                <w:szCs w:val="19"/>
+              </w:rPr>
+              <w:t xml:space="preserve">Admin dashboard (website only): platform admins granted from the command line, audit log, user support actions. Currencies moved from code into a table managed by admins. A currency the rates provider stops quoting no longer stops the others.</w:t>
+            </w:r>
+          </w:p>
+        </w:tc>
+      </w:tr>
     </w:tbl>
     <w:p>
       <w:pPr>
@@ -1543,6 +1664,98 @@
                 <w:szCs w:val="19"/>
               </w:rPr>
               <w:t xml:space="preserve">M. Altaweel</w:t>
+            </w:r>
+          </w:p>
+        </w:tc>
+      </w:tr>
+      <w:tr>
+        <w:trPr>
+          <w:cantSplit/>
+        </w:trPr>
+        <w:tc>
+          <w:tcPr>
+            <w:tcW w:type="dxa" w:w="2891"/>
+            <w:tcBorders>
+              <w:top w:val="single" w:color="9FB6CD" w:sz="4"/>
+              <w:left w:val="single" w:color="9FB6CD" w:sz="4"/>
+              <w:bottom w:val="single" w:color="9FB6CD" w:sz="4"/>
+              <w:right w:val="single" w:color="9FB6CD" w:sz="4"/>
+            </w:tcBorders>
+            <w:tcMar>
+              <w:top w:type="dxa" w:w="60"/>
+              <w:left w:type="dxa" w:w="100"/>
+              <w:bottom w:type="dxa" w:w="60"/>
+              <w:right w:type="dxa" w:w="100"/>
+            </w:tcMar>
+          </w:tcPr>
+          <w:p>
+            <w:pPr>
+              <w:spacing w:after="0"/>
+            </w:pPr>
+            <w:r>
+              <w:rPr>
+                <w:sz w:val="19"/>
+                <w:szCs w:val="19"/>
+              </w:rPr>
+              <w:t xml:space="preserve">Admin dashboard and currencies</w:t>
+            </w:r>
+          </w:p>
+        </w:tc>
+        <w:tc>
+          <w:tcPr>
+            <w:tcW w:type="dxa" w:w="3855"/>
+            <w:tcBorders>
+              <w:top w:val="single" w:color="9FB6CD" w:sz="4"/>
+              <w:left w:val="single" w:color="9FB6CD" w:sz="4"/>
+              <w:bottom w:val="single" w:color="9FB6CD" w:sz="4"/>
+              <w:right w:val="single" w:color="9FB6CD" w:sz="4"/>
+            </w:tcBorders>
+            <w:tcMar>
+              <w:top w:type="dxa" w:w="60"/>
+              <w:left w:type="dxa" w:w="100"/>
+              <w:bottom w:type="dxa" w:w="60"/>
+              <w:right w:type="dxa" w:w="100"/>
+            </w:tcMar>
+          </w:tcPr>
+          <w:p>
+            <w:pPr>
+              <w:spacing w:after="0"/>
+            </w:pPr>
+            <w:r>
+              <w:rPr>
+                <w:sz w:val="19"/>
+                <w:szCs w:val="19"/>
+              </w:rPr>
+              <w:t xml:space="preserve">backend/app/domain/admin/, frontend/src/app/admin/</w:t>
+            </w:r>
+          </w:p>
+        </w:tc>
+        <w:tc>
+          <w:tcPr>
+            <w:tcW w:type="dxa" w:w="2892"/>
+            <w:tcBorders>
+              <w:top w:val="single" w:color="9FB6CD" w:sz="4"/>
+              <w:left w:val="single" w:color="9FB6CD" w:sz="4"/>
+              <w:bottom w:val="single" w:color="9FB6CD" w:sz="4"/>
+              <w:right w:val="single" w:color="9FB6CD" w:sz="4"/>
+            </w:tcBorders>
+            <w:tcMar>
+              <w:top w:type="dxa" w:w="60"/>
+              <w:left w:type="dxa" w:w="100"/>
+              <w:bottom w:type="dxa" w:w="60"/>
+              <w:right w:type="dxa" w:w="100"/>
+            </w:tcMar>
+          </w:tcPr>
+          <w:p>
+            <w:pPr>
+              <w:spacing w:after="0"/>
+            </w:pPr>
+            <w:r>
+              <w:rPr>
+                <w:sz w:val="19"/>
+                <w:szCs w:val="19"/>
+              </w:rPr>
+              <w:t xml:space="preserve">R. Arslan</w:t>
             </w:r>
           </w:p>
         </w:tc>
@@ -3824,7 +4037,7 @@
                 <w:sz w:val="19"/>
                 <w:szCs w:val="19"/>
               </w:rPr>
-              <w:t xml:space="preserve">16 migrations, each with a downgrade</w:t>
+              <w:t xml:space="preserve">18 migrations, each with a downgrade</w:t>
             </w:r>
           </w:p>
         </w:tc>
@@ -8770,6 +8983,69 @@
                 <w:sz w:val="19"/>
                 <w:szCs w:val="19"/>
               </w:rPr>
+              <w:t xml:space="preserve">Platform admin</w:t>
+            </w:r>
+          </w:p>
+        </w:tc>
+        <w:tc>
+          <w:tcPr>
+            <w:tcW w:type="dxa" w:w="6885"/>
+            <w:tcBorders>
+              <w:top w:val="single" w:color="9FB6CD" w:sz="4"/>
+              <w:left w:val="single" w:color="9FB6CD" w:sz="4"/>
+              <w:bottom w:val="single" w:color="9FB6CD" w:sz="4"/>
+              <w:right w:val="single" w:color="9FB6CD" w:sz="4"/>
+            </w:tcBorders>
+            <w:tcMar>
+              <w:top w:type="dxa" w:w="60"/>
+              <w:left w:type="dxa" w:w="100"/>
+              <w:bottom w:type="dxa" w:w="60"/>
+              <w:right w:type="dxa" w:w="100"/>
+            </w:tcMar>
+          </w:tcPr>
+          <w:p>
+            <w:pPr>
+              <w:spacing w:after="0"/>
+            </w:pPr>
+            <w:r>
+              <w:rPr>
+                <w:sz w:val="19"/>
+                <w:szCs w:val="19"/>
+              </w:rPr>
+              <w:t xml:space="preserve">A member of the team, made admin only from the command line. Uses the website dashboard with 2FA on; sees account details, never money.</w:t>
+            </w:r>
+          </w:p>
+        </w:tc>
+      </w:tr>
+      <w:tr>
+        <w:trPr>
+          <w:cantSplit/>
+        </w:trPr>
+        <w:tc>
+          <w:tcPr>
+            <w:tcW w:type="dxa" w:w="2753"/>
+            <w:tcBorders>
+              <w:top w:val="single" w:color="9FB6CD" w:sz="4"/>
+              <w:left w:val="single" w:color="9FB6CD" w:sz="4"/>
+              <w:bottom w:val="single" w:color="9FB6CD" w:sz="4"/>
+              <w:right w:val="single" w:color="9FB6CD" w:sz="4"/>
+            </w:tcBorders>
+            <w:tcMar>
+              <w:top w:type="dxa" w:w="60"/>
+              <w:left w:type="dxa" w:w="100"/>
+              <w:bottom w:type="dxa" w:w="60"/>
+              <w:right w:type="dxa" w:w="100"/>
+            </w:tcMar>
+          </w:tcPr>
+          <w:p>
+            <w:pPr>
+              <w:spacing w:after="0"/>
+            </w:pPr>
+            <w:r>
+              <w:rPr>
+                <w:sz w:val="19"/>
+                <w:szCs w:val="19"/>
+              </w:rPr>
               <w:t xml:space="preserve">Google</w:t>
             </w:r>
           </w:p>
@@ -12598,6 +12874,456 @@
                 <w:szCs w:val="19"/>
               </w:rPr>
               <w:t xml:space="preserve">Settings › Notifications</w:t>
+            </w:r>
+          </w:p>
+        </w:tc>
+      </w:tr>
+      <w:tr>
+        <w:trPr>
+          <w:cantSplit/>
+        </w:trPr>
+        <w:tc>
+          <w:tcPr>
+            <w:tcW w:type="dxa" w:w="741"/>
+            <w:tcBorders>
+              <w:top w:val="single" w:color="9FB6CD" w:sz="4"/>
+              <w:left w:val="single" w:color="9FB6CD" w:sz="4"/>
+              <w:bottom w:val="single" w:color="9FB6CD" w:sz="4"/>
+              <w:right w:val="single" w:color="9FB6CD" w:sz="4"/>
+            </w:tcBorders>
+            <w:tcMar>
+              <w:top w:type="dxa" w:w="60"/>
+              <w:left w:type="dxa" w:w="100"/>
+              <w:bottom w:type="dxa" w:w="60"/>
+              <w:right w:type="dxa" w:w="100"/>
+            </w:tcMar>
+          </w:tcPr>
+          <w:p>
+            <w:pPr>
+              <w:spacing w:after="0"/>
+            </w:pPr>
+            <w:r>
+              <w:rPr>
+                <w:sz w:val="19"/>
+                <w:szCs w:val="19"/>
+              </w:rPr>
+              <w:t xml:space="preserve">UC-25</w:t>
+            </w:r>
+          </w:p>
+        </w:tc>
+        <w:tc>
+          <w:tcPr>
+            <w:tcW w:type="dxa" w:w="2594"/>
+            <w:tcBorders>
+              <w:top w:val="single" w:color="9FB6CD" w:sz="4"/>
+              <w:left w:val="single" w:color="9FB6CD" w:sz="4"/>
+              <w:bottom w:val="single" w:color="9FB6CD" w:sz="4"/>
+              <w:right w:val="single" w:color="9FB6CD" w:sz="4"/>
+            </w:tcBorders>
+            <w:tcMar>
+              <w:top w:type="dxa" w:w="60"/>
+              <w:left w:type="dxa" w:w="100"/>
+              <w:bottom w:type="dxa" w:w="60"/>
+              <w:right w:type="dxa" w:w="100"/>
+            </w:tcMar>
+          </w:tcPr>
+          <w:p>
+            <w:pPr>
+              <w:spacing w:after="0"/>
+            </w:pPr>
+            <w:r>
+              <w:rPr>
+                <w:sz w:val="19"/>
+                <w:szCs w:val="19"/>
+              </w:rPr>
+              <w:t xml:space="preserve">Support a user: search, view account, disable/enable, sign out everywhere, resend confirmation</w:t>
+            </w:r>
+          </w:p>
+        </w:tc>
+        <w:tc>
+          <w:tcPr>
+            <w:tcW w:type="dxa" w:w="1359"/>
+            <w:tcBorders>
+              <w:top w:val="single" w:color="9FB6CD" w:sz="4"/>
+              <w:left w:val="single" w:color="9FB6CD" w:sz="4"/>
+              <w:bottom w:val="single" w:color="9FB6CD" w:sz="4"/>
+              <w:right w:val="single" w:color="9FB6CD" w:sz="4"/>
+            </w:tcBorders>
+            <w:tcMar>
+              <w:top w:type="dxa" w:w="60"/>
+              <w:left w:type="dxa" w:w="100"/>
+              <w:bottom w:type="dxa" w:w="60"/>
+              <w:right w:type="dxa" w:w="100"/>
+            </w:tcMar>
+          </w:tcPr>
+          <w:p>
+            <w:pPr>
+              <w:spacing w:after="0"/>
+            </w:pPr>
+            <w:r>
+              <w:rPr>
+                <w:sz w:val="19"/>
+                <w:szCs w:val="19"/>
+              </w:rPr>
+              <w:t xml:space="preserve">Platform admin</w:t>
+            </w:r>
+          </w:p>
+        </w:tc>
+        <w:tc>
+          <w:tcPr>
+            <w:tcW w:type="dxa" w:w="2965"/>
+            <w:tcBorders>
+              <w:top w:val="single" w:color="9FB6CD" w:sz="4"/>
+              <w:left w:val="single" w:color="9FB6CD" w:sz="4"/>
+              <w:bottom w:val="single" w:color="9FB6CD" w:sz="4"/>
+              <w:right w:val="single" w:color="9FB6CD" w:sz="4"/>
+            </w:tcBorders>
+            <w:tcMar>
+              <w:top w:type="dxa" w:w="60"/>
+              <w:left w:type="dxa" w:w="100"/>
+              <w:bottom w:type="dxa" w:w="60"/>
+              <w:right w:type="dxa" w:w="100"/>
+            </w:tcMar>
+          </w:tcPr>
+          <w:p>
+            <w:pPr>
+              <w:spacing w:after="0"/>
+            </w:pPr>
+            <w:r>
+              <w:rPr>
+                <w:sz w:val="19"/>
+                <w:szCs w:val="19"/>
+              </w:rPr>
+              <w:t xml:space="preserve">/admin/users, /admin/users/{id}/*</w:t>
+            </w:r>
+          </w:p>
+        </w:tc>
+        <w:tc>
+          <w:tcPr>
+            <w:tcW w:type="dxa" w:w="1979"/>
+            <w:tcBorders>
+              <w:top w:val="single" w:color="9FB6CD" w:sz="4"/>
+              <w:left w:val="single" w:color="9FB6CD" w:sz="4"/>
+              <w:bottom w:val="single" w:color="9FB6CD" w:sz="4"/>
+              <w:right w:val="single" w:color="9FB6CD" w:sz="4"/>
+            </w:tcBorders>
+            <w:tcMar>
+              <w:top w:type="dxa" w:w="60"/>
+              <w:left w:type="dxa" w:w="100"/>
+              <w:bottom w:type="dxa" w:w="60"/>
+              <w:right w:type="dxa" w:w="100"/>
+            </w:tcMar>
+          </w:tcPr>
+          <w:p>
+            <w:pPr>
+              <w:spacing w:after="0"/>
+            </w:pPr>
+            <w:r>
+              <w:rPr>
+                <w:sz w:val="19"/>
+                <w:szCs w:val="19"/>
+              </w:rPr>
+              <w:t xml:space="preserve">Website /admin/users</w:t>
+            </w:r>
+          </w:p>
+        </w:tc>
+      </w:tr>
+      <w:tr>
+        <w:trPr>
+          <w:cantSplit/>
+        </w:trPr>
+        <w:tc>
+          <w:tcPr>
+            <w:tcW w:type="dxa" w:w="741"/>
+            <w:tcBorders>
+              <w:top w:val="single" w:color="9FB6CD" w:sz="4"/>
+              <w:left w:val="single" w:color="9FB6CD" w:sz="4"/>
+              <w:bottom w:val="single" w:color="9FB6CD" w:sz="4"/>
+              <w:right w:val="single" w:color="9FB6CD" w:sz="4"/>
+            </w:tcBorders>
+            <w:tcMar>
+              <w:top w:type="dxa" w:w="60"/>
+              <w:left w:type="dxa" w:w="100"/>
+              <w:bottom w:type="dxa" w:w="60"/>
+              <w:right w:type="dxa" w:w="100"/>
+            </w:tcMar>
+          </w:tcPr>
+          <w:p>
+            <w:pPr>
+              <w:spacing w:after="0"/>
+            </w:pPr>
+            <w:r>
+              <w:rPr>
+                <w:sz w:val="19"/>
+                <w:szCs w:val="19"/>
+              </w:rPr>
+              <w:t xml:space="preserve">UC-26</w:t>
+            </w:r>
+          </w:p>
+        </w:tc>
+        <w:tc>
+          <w:tcPr>
+            <w:tcW w:type="dxa" w:w="2594"/>
+            <w:tcBorders>
+              <w:top w:val="single" w:color="9FB6CD" w:sz="4"/>
+              <w:left w:val="single" w:color="9FB6CD" w:sz="4"/>
+              <w:bottom w:val="single" w:color="9FB6CD" w:sz="4"/>
+              <w:right w:val="single" w:color="9FB6CD" w:sz="4"/>
+            </w:tcBorders>
+            <w:tcMar>
+              <w:top w:type="dxa" w:w="60"/>
+              <w:left w:type="dxa" w:w="100"/>
+              <w:bottom w:type="dxa" w:w="60"/>
+              <w:right w:type="dxa" w:w="100"/>
+            </w:tcMar>
+          </w:tcPr>
+          <w:p>
+            <w:pPr>
+              <w:spacing w:after="0"/>
+            </w:pPr>
+            <w:r>
+              <w:rPr>
+                <w:sz w:val="19"/>
+                <w:szCs w:val="19"/>
+              </w:rPr>
+              <w:t xml:space="preserve">Manage currencies: add, hide, show</w:t>
+            </w:r>
+          </w:p>
+        </w:tc>
+        <w:tc>
+          <w:tcPr>
+            <w:tcW w:type="dxa" w:w="1359"/>
+            <w:tcBorders>
+              <w:top w:val="single" w:color="9FB6CD" w:sz="4"/>
+              <w:left w:val="single" w:color="9FB6CD" w:sz="4"/>
+              <w:bottom w:val="single" w:color="9FB6CD" w:sz="4"/>
+              <w:right w:val="single" w:color="9FB6CD" w:sz="4"/>
+            </w:tcBorders>
+            <w:tcMar>
+              <w:top w:type="dxa" w:w="60"/>
+              <w:left w:type="dxa" w:w="100"/>
+              <w:bottom w:type="dxa" w:w="60"/>
+              <w:right w:type="dxa" w:w="100"/>
+            </w:tcMar>
+          </w:tcPr>
+          <w:p>
+            <w:pPr>
+              <w:spacing w:after="0"/>
+            </w:pPr>
+            <w:r>
+              <w:rPr>
+                <w:sz w:val="19"/>
+                <w:szCs w:val="19"/>
+              </w:rPr>
+              <w:t xml:space="preserve">Platform admin</w:t>
+            </w:r>
+          </w:p>
+        </w:tc>
+        <w:tc>
+          <w:tcPr>
+            <w:tcW w:type="dxa" w:w="2965"/>
+            <w:tcBorders>
+              <w:top w:val="single" w:color="9FB6CD" w:sz="4"/>
+              <w:left w:val="single" w:color="9FB6CD" w:sz="4"/>
+              <w:bottom w:val="single" w:color="9FB6CD" w:sz="4"/>
+              <w:right w:val="single" w:color="9FB6CD" w:sz="4"/>
+            </w:tcBorders>
+            <w:tcMar>
+              <w:top w:type="dxa" w:w="60"/>
+              <w:left w:type="dxa" w:w="100"/>
+              <w:bottom w:type="dxa" w:w="60"/>
+              <w:right w:type="dxa" w:w="100"/>
+            </w:tcMar>
+          </w:tcPr>
+          <w:p>
+            <w:pPr>
+              <w:spacing w:after="0"/>
+            </w:pPr>
+            <w:r>
+              <w:rPr>
+                <w:sz w:val="19"/>
+                <w:szCs w:val="19"/>
+              </w:rPr>
+              <w:t xml:space="preserve">/admin/currencies; GET /currency/list</w:t>
+            </w:r>
+          </w:p>
+        </w:tc>
+        <w:tc>
+          <w:tcPr>
+            <w:tcW w:type="dxa" w:w="1979"/>
+            <w:tcBorders>
+              <w:top w:val="single" w:color="9FB6CD" w:sz="4"/>
+              <w:left w:val="single" w:color="9FB6CD" w:sz="4"/>
+              <w:bottom w:val="single" w:color="9FB6CD" w:sz="4"/>
+              <w:right w:val="single" w:color="9FB6CD" w:sz="4"/>
+            </w:tcBorders>
+            <w:tcMar>
+              <w:top w:type="dxa" w:w="60"/>
+              <w:left w:type="dxa" w:w="100"/>
+              <w:bottom w:type="dxa" w:w="60"/>
+              <w:right w:type="dxa" w:w="100"/>
+            </w:tcMar>
+          </w:tcPr>
+          <w:p>
+            <w:pPr>
+              <w:spacing w:after="0"/>
+            </w:pPr>
+            <w:r>
+              <w:rPr>
+                <w:sz w:val="19"/>
+                <w:szCs w:val="19"/>
+              </w:rPr>
+              <w:t xml:space="preserve">Website /admin/currencies</w:t>
+            </w:r>
+          </w:p>
+        </w:tc>
+      </w:tr>
+      <w:tr>
+        <w:trPr>
+          <w:cantSplit/>
+        </w:trPr>
+        <w:tc>
+          <w:tcPr>
+            <w:tcW w:type="dxa" w:w="741"/>
+            <w:tcBorders>
+              <w:top w:val="single" w:color="9FB6CD" w:sz="4"/>
+              <w:left w:val="single" w:color="9FB6CD" w:sz="4"/>
+              <w:bottom w:val="single" w:color="9FB6CD" w:sz="4"/>
+              <w:right w:val="single" w:color="9FB6CD" w:sz="4"/>
+            </w:tcBorders>
+            <w:tcMar>
+              <w:top w:type="dxa" w:w="60"/>
+              <w:left w:type="dxa" w:w="100"/>
+              <w:bottom w:type="dxa" w:w="60"/>
+              <w:right w:type="dxa" w:w="100"/>
+            </w:tcMar>
+          </w:tcPr>
+          <w:p>
+            <w:pPr>
+              <w:spacing w:after="0"/>
+            </w:pPr>
+            <w:r>
+              <w:rPr>
+                <w:sz w:val="19"/>
+                <w:szCs w:val="19"/>
+              </w:rPr>
+              <w:t xml:space="preserve">UC-27</w:t>
+            </w:r>
+          </w:p>
+        </w:tc>
+        <w:tc>
+          <w:tcPr>
+            <w:tcW w:type="dxa" w:w="2594"/>
+            <w:tcBorders>
+              <w:top w:val="single" w:color="9FB6CD" w:sz="4"/>
+              <w:left w:val="single" w:color="9FB6CD" w:sz="4"/>
+              <w:bottom w:val="single" w:color="9FB6CD" w:sz="4"/>
+              <w:right w:val="single" w:color="9FB6CD" w:sz="4"/>
+            </w:tcBorders>
+            <w:tcMar>
+              <w:top w:type="dxa" w:w="60"/>
+              <w:left w:type="dxa" w:w="100"/>
+              <w:bottom w:type="dxa" w:w="60"/>
+              <w:right w:type="dxa" w:w="100"/>
+            </w:tcMar>
+          </w:tcPr>
+          <w:p>
+            <w:pPr>
+              <w:spacing w:after="0"/>
+            </w:pPr>
+            <w:r>
+              <w:rPr>
+                <w:sz w:val="19"/>
+                <w:szCs w:val="19"/>
+              </w:rPr>
+              <w:t xml:space="preserve">See product statistics, system status and the audit log</w:t>
+            </w:r>
+          </w:p>
+        </w:tc>
+        <w:tc>
+          <w:tcPr>
+            <w:tcW w:type="dxa" w:w="1359"/>
+            <w:tcBorders>
+              <w:top w:val="single" w:color="9FB6CD" w:sz="4"/>
+              <w:left w:val="single" w:color="9FB6CD" w:sz="4"/>
+              <w:bottom w:val="single" w:color="9FB6CD" w:sz="4"/>
+              <w:right w:val="single" w:color="9FB6CD" w:sz="4"/>
+            </w:tcBorders>
+            <w:tcMar>
+              <w:top w:type="dxa" w:w="60"/>
+              <w:left w:type="dxa" w:w="100"/>
+              <w:bottom w:type="dxa" w:w="60"/>
+              <w:right w:type="dxa" w:w="100"/>
+            </w:tcMar>
+          </w:tcPr>
+          <w:p>
+            <w:pPr>
+              <w:spacing w:after="0"/>
+            </w:pPr>
+            <w:r>
+              <w:rPr>
+                <w:sz w:val="19"/>
+                <w:szCs w:val="19"/>
+              </w:rPr>
+              <w:t xml:space="preserve">Platform admin</w:t>
+            </w:r>
+          </w:p>
+        </w:tc>
+        <w:tc>
+          <w:tcPr>
+            <w:tcW w:type="dxa" w:w="2965"/>
+            <w:tcBorders>
+              <w:top w:val="single" w:color="9FB6CD" w:sz="4"/>
+              <w:left w:val="single" w:color="9FB6CD" w:sz="4"/>
+              <w:bottom w:val="single" w:color="9FB6CD" w:sz="4"/>
+              <w:right w:val="single" w:color="9FB6CD" w:sz="4"/>
+            </w:tcBorders>
+            <w:tcMar>
+              <w:top w:type="dxa" w:w="60"/>
+              <w:left w:type="dxa" w:w="100"/>
+              <w:bottom w:type="dxa" w:w="60"/>
+              <w:right w:type="dxa" w:w="100"/>
+            </w:tcMar>
+          </w:tcPr>
+          <w:p>
+            <w:pPr>
+              <w:spacing w:after="0"/>
+            </w:pPr>
+            <w:r>
+              <w:rPr>
+                <w:sz w:val="19"/>
+                <w:szCs w:val="19"/>
+              </w:rPr>
+              <w:t xml:space="preserve">/admin/stats, /admin/system, /admin/audit</w:t>
+            </w:r>
+          </w:p>
+        </w:tc>
+        <w:tc>
+          <w:tcPr>
+            <w:tcW w:type="dxa" w:w="1979"/>
+            <w:tcBorders>
+              <w:top w:val="single" w:color="9FB6CD" w:sz="4"/>
+              <w:left w:val="single" w:color="9FB6CD" w:sz="4"/>
+              <w:bottom w:val="single" w:color="9FB6CD" w:sz="4"/>
+              <w:right w:val="single" w:color="9FB6CD" w:sz="4"/>
+            </w:tcBorders>
+            <w:tcMar>
+              <w:top w:type="dxa" w:w="60"/>
+              <w:left w:type="dxa" w:w="100"/>
+              <w:bottom w:type="dxa" w:w="60"/>
+              <w:right w:type="dxa" w:w="100"/>
+            </w:tcMar>
+          </w:tcPr>
+          <w:p>
+            <w:pPr>
+              <w:spacing w:after="0"/>
+            </w:pPr>
+            <w:r>
+              <w:rPr>
+                <w:sz w:val="19"/>
+                <w:szCs w:val="19"/>
+              </w:rPr>
+              <w:t xml:space="preserve">Website /admin</w:t>
             </w:r>
           </w:p>
         </w:tc>
@@ -15468,7 +16194,7 @@
                 <w:sz w:val="19"/>
                 <w:szCs w:val="19"/>
               </w:rPr>
-              <w:t xml:space="preserve">Exchange rates with cache and stale fallback</w:t>
+              <w:t xml:space="preserve">Supported currencies (catalog with a 1-minute cache), exchange rates with cache and stale fallback</w:t>
             </w:r>
           </w:p>
         </w:tc>
@@ -15497,7 +16223,7 @@
                 <w:sz w:val="19"/>
                 <w:szCs w:val="19"/>
               </w:rPr>
-              <w:t xml:space="preserve">exchange_rates</w:t>
+              <w:t xml:space="preserve">currencies, exchange_rates</w:t>
             </w:r>
           </w:p>
         </w:tc>
@@ -15866,6 +16592,98 @@
                 <w:szCs w:val="19"/>
               </w:rPr>
               <w:t xml:space="preserve">push_devices</w:t>
+            </w:r>
+          </w:p>
+        </w:tc>
+      </w:tr>
+      <w:tr>
+        <w:trPr>
+          <w:cantSplit/>
+        </w:trPr>
+        <w:tc>
+          <w:tcPr>
+            <w:tcW w:type="dxa" w:w="1294"/>
+            <w:tcBorders>
+              <w:top w:val="single" w:color="9FB6CD" w:sz="4"/>
+              <w:left w:val="single" w:color="9FB6CD" w:sz="4"/>
+              <w:bottom w:val="single" w:color="9FB6CD" w:sz="4"/>
+              <w:right w:val="single" w:color="9FB6CD" w:sz="4"/>
+            </w:tcBorders>
+            <w:tcMar>
+              <w:top w:type="dxa" w:w="60"/>
+              <w:left w:type="dxa" w:w="100"/>
+              <w:bottom w:type="dxa" w:w="60"/>
+              <w:right w:type="dxa" w:w="100"/>
+            </w:tcMar>
+          </w:tcPr>
+          <w:p>
+            <w:pPr>
+              <w:spacing w:after="0"/>
+            </w:pPr>
+            <w:r>
+              <w:rPr>
+                <w:sz w:val="19"/>
+                <w:szCs w:val="19"/>
+              </w:rPr>
+              <w:t xml:space="preserve">admin</w:t>
+            </w:r>
+          </w:p>
+        </w:tc>
+        <w:tc>
+          <w:tcPr>
+            <w:tcW w:type="dxa" w:w="4603"/>
+            <w:tcBorders>
+              <w:top w:val="single" w:color="9FB6CD" w:sz="4"/>
+              <w:left w:val="single" w:color="9FB6CD" w:sz="4"/>
+              <w:bottom w:val="single" w:color="9FB6CD" w:sz="4"/>
+              <w:right w:val="single" w:color="9FB6CD" w:sz="4"/>
+            </w:tcBorders>
+            <w:tcMar>
+              <w:top w:type="dxa" w:w="60"/>
+              <w:left w:type="dxa" w:w="100"/>
+              <w:bottom w:type="dxa" w:w="60"/>
+              <w:right w:type="dxa" w:w="100"/>
+            </w:tcMar>
+          </w:tcPr>
+          <w:p>
+            <w:pPr>
+              <w:spacing w:after="0"/>
+            </w:pPr>
+            <w:r>
+              <w:rPr>
+                <w:sz w:val="19"/>
+                <w:szCs w:val="19"/>
+              </w:rPr>
+              <w:t xml:space="preserve">Platform admins, statistics without amounts, user support actions, system status, currency management, append-only audit log</w:t>
+            </w:r>
+          </w:p>
+        </w:tc>
+        <w:tc>
+          <w:tcPr>
+            <w:tcW w:type="dxa" w:w="3741"/>
+            <w:tcBorders>
+              <w:top w:val="single" w:color="9FB6CD" w:sz="4"/>
+              <w:left w:val="single" w:color="9FB6CD" w:sz="4"/>
+              <w:bottom w:val="single" w:color="9FB6CD" w:sz="4"/>
+              <w:right w:val="single" w:color="9FB6CD" w:sz="4"/>
+            </w:tcBorders>
+            <w:tcMar>
+              <w:top w:type="dxa" w:w="60"/>
+              <w:left w:type="dxa" w:w="100"/>
+              <w:bottom w:type="dxa" w:w="60"/>
+              <w:right w:type="dxa" w:w="100"/>
+            </w:tcMar>
+          </w:tcPr>
+          <w:p>
+            <w:pPr>
+              <w:spacing w:after="0"/>
+            </w:pPr>
+            <w:r>
+              <w:rPr>
+                <w:sz w:val="19"/>
+                <w:szCs w:val="19"/>
+              </w:rPr>
+              <w:t xml:space="preserve">platform_admins, admin_audit_log</w:t>
             </w:r>
           </w:p>
         </w:tc>
@@ -15889,7 +16707,7 @@
         <w:spacing w:after="120"/>
       </w:pPr>
       <w:r>
-        <w:t xml:space="preserve">The 23 tables fall into three groups. A user owns all personal data; a group owns only group data. The single bridge between them is the </w:t>
+        <w:t xml:space="preserve">The 26 tables fall into four groups. A user owns all personal data; a group owns only group data. The single bridge between them is the </w:t>
       </w:r>
       <w:r>
         <w:rPr>
@@ -15899,7 +16717,7 @@
         <w:t xml:space="preserve">share copy</w:t>
       </w:r>
       <w:r>
-        <w:t xml:space="preserve">: a member's share can become a personal expense that the member owns, so the group never reads personal tables.</w:t>
+        <w:t xml:space="preserve">: a member's share can become a personal expense that the member owns, so the group never reads personal tables. The admin tables point at users only; admin queries never join budget, expense, goal or group tables.</w:t>
       </w:r>
     </w:p>
     <w:p>
@@ -15911,7 +16729,7 @@
       <w:r>
         <w:drawing>
           <wp:inline distT="0" distB="0" distL="0" distR="0">
-            <wp:extent cx="5905500" cy="7810500"/>
+            <wp:extent cx="5486400" cy="7810500"/>
             <wp:effectExtent t="0" r="0" b="0" l="0"/>
             <wp:docPr id="1" name="04_domain.png" descr="Domain model (entities and relationships)" title="Domain model (entities and relationships)"/>
             <wp:cNvGraphicFramePr>
@@ -15936,7 +16754,7 @@
                   <pic:spPr bwMode="auto">
                     <a:xfrm>
                       <a:off x="0" y="0"/>
-                      <a:ext cx="5905500" cy="7810500"/>
+                      <a:ext cx="5486400" cy="7810500"/>
                     </a:xfrm>
                     <a:prstGeom prst="rect">
                       <a:avLst/>
@@ -18275,7 +19093,7 @@
                 <w:sz w:val="19"/>
                 <w:szCs w:val="19"/>
               </w:rPr>
-              <w:t xml:space="preserve">backend/app/domain/&lt;name&gt;/</w:t>
+              <w:t xml:space="preserve">backend/app/cli.py</w:t>
             </w:r>
           </w:p>
         </w:tc>
@@ -18304,7 +19122,7 @@
                 <w:sz w:val="19"/>
                 <w:szCs w:val="19"/>
               </w:rPr>
-              <w:t xml:space="preserve">router.py, schemas.py, service.py, repository.py, models.py per domain</w:t>
+              <w:t xml:space="preserve">Operator commands: grant-admin, revoke-admin, list-admins</w:t>
             </w:r>
           </w:p>
         </w:tc>
@@ -18338,7 +19156,7 @@
                 <w:sz w:val="19"/>
                 <w:szCs w:val="19"/>
               </w:rPr>
-              <w:t xml:space="preserve">backend/app/core/</w:t>
+              <w:t xml:space="preserve">backend/app/domain/&lt;name&gt;/</w:t>
             </w:r>
           </w:p>
         </w:tc>
@@ -18367,7 +19185,7 @@
                 <w:sz w:val="19"/>
                 <w:szCs w:val="19"/>
               </w:rPr>
-              <w:t xml:space="preserve">Cross-cutting modules (section 3.5)</w:t>
+              <w:t xml:space="preserve">router.py, schemas.py, service.py, repository.py, models.py per domain</w:t>
             </w:r>
           </w:p>
         </w:tc>
@@ -18401,7 +19219,7 @@
                 <w:sz w:val="19"/>
                 <w:szCs w:val="19"/>
               </w:rPr>
-              <w:t xml:space="preserve">backend/app/ml/</w:t>
+              <w:t xml:space="preserve">backend/app/core/</w:t>
             </w:r>
           </w:p>
         </w:tc>
@@ -18430,7 +19248,7 @@
                 <w:sz w:val="19"/>
                 <w:szCs w:val="19"/>
               </w:rPr>
-              <w:t xml:space="preserve">Model runtime and exported weights</w:t>
+              <w:t xml:space="preserve">Cross-cutting modules (section 3.5)</w:t>
             </w:r>
           </w:p>
         </w:tc>
@@ -18464,7 +19282,7 @@
                 <w:sz w:val="19"/>
                 <w:szCs w:val="19"/>
               </w:rPr>
-              <w:t xml:space="preserve">backend/app/migrations/</w:t>
+              <w:t xml:space="preserve">backend/app/ml/</w:t>
             </w:r>
           </w:p>
         </w:tc>
@@ -18493,7 +19311,7 @@
                 <w:sz w:val="19"/>
                 <w:szCs w:val="19"/>
               </w:rPr>
-              <w:t xml:space="preserve">Alembic migrations (16)</w:t>
+              <w:t xml:space="preserve">Model runtime and exported weights</w:t>
             </w:r>
           </w:p>
         </w:tc>
@@ -18527,7 +19345,7 @@
                 <w:sz w:val="19"/>
                 <w:szCs w:val="19"/>
               </w:rPr>
-              <w:t xml:space="preserve">backend/tests/</w:t>
+              <w:t xml:space="preserve">backend/app/migrations/</w:t>
             </w:r>
           </w:p>
         </w:tc>
@@ -18556,7 +19374,7 @@
                 <w:sz w:val="19"/>
                 <w:szCs w:val="19"/>
               </w:rPr>
-              <w:t xml:space="preserve">pytest suite (350+ tests): unit, API, authorization and penetration tests</w:t>
+              <w:t xml:space="preserve">Alembic migrations (18)</w:t>
             </w:r>
           </w:p>
         </w:tc>
@@ -18590,6 +19408,69 @@
                 <w:sz w:val="19"/>
                 <w:szCs w:val="19"/>
               </w:rPr>
+              <w:t xml:space="preserve">backend/tests/</w:t>
+            </w:r>
+          </w:p>
+        </w:tc>
+        <w:tc>
+          <w:tcPr>
+            <w:tcW w:type="dxa" w:w="6024"/>
+            <w:tcBorders>
+              <w:top w:val="single" w:color="9FB6CD" w:sz="4"/>
+              <w:left w:val="single" w:color="9FB6CD" w:sz="4"/>
+              <w:bottom w:val="single" w:color="9FB6CD" w:sz="4"/>
+              <w:right w:val="single" w:color="9FB6CD" w:sz="4"/>
+            </w:tcBorders>
+            <w:tcMar>
+              <w:top w:type="dxa" w:w="60"/>
+              <w:left w:type="dxa" w:w="100"/>
+              <w:bottom w:type="dxa" w:w="60"/>
+              <w:right w:type="dxa" w:w="100"/>
+            </w:tcMar>
+          </w:tcPr>
+          <w:p>
+            <w:pPr>
+              <w:spacing w:after="0"/>
+            </w:pPr>
+            <w:r>
+              <w:rPr>
+                <w:sz w:val="19"/>
+                <w:szCs w:val="19"/>
+              </w:rPr>
+              <w:t xml:space="preserve">pytest suite (350+ tests): unit, API, authorization and penetration tests</w:t>
+            </w:r>
+          </w:p>
+        </w:tc>
+      </w:tr>
+      <w:tr>
+        <w:trPr>
+          <w:cantSplit/>
+        </w:trPr>
+        <w:tc>
+          <w:tcPr>
+            <w:tcW w:type="dxa" w:w="3614"/>
+            <w:tcBorders>
+              <w:top w:val="single" w:color="9FB6CD" w:sz="4"/>
+              <w:left w:val="single" w:color="9FB6CD" w:sz="4"/>
+              <w:bottom w:val="single" w:color="9FB6CD" w:sz="4"/>
+              <w:right w:val="single" w:color="9FB6CD" w:sz="4"/>
+            </w:tcBorders>
+            <w:tcMar>
+              <w:top w:type="dxa" w:w="60"/>
+              <w:left w:type="dxa" w:w="100"/>
+              <w:bottom w:type="dxa" w:w="60"/>
+              <w:right w:type="dxa" w:w="100"/>
+            </w:tcMar>
+          </w:tcPr>
+          <w:p>
+            <w:pPr>
+              <w:spacing w:after="0"/>
+            </w:pPr>
+            <w:r>
+              <w:rPr>
+                <w:sz w:val="19"/>
+                <w:szCs w:val="19"/>
+              </w:rPr>
               <w:t xml:space="preserve">frontend/src/app/</w:t>
             </w:r>
           </w:p>
@@ -18619,7 +19500,7 @@
                 <w:sz w:val="19"/>
                 <w:szCs w:val="19"/>
               </w:rPr>
-              <w:t xml:space="preserve">Next.js routes: (auth), (app)/overview, budget, expenses, categories, goals, groups, assistant, settings; join, privacy, terms</w:t>
+              <w:t xml:space="preserve">Next.js routes: (auth), (app)/overview, budget, expenses, categories, goals, groups, assistant, settings; admin (website only); join, privacy, terms</w:t>
             </w:r>
           </w:p>
         </w:tc>
@@ -22885,6 +23766,69 @@
                 <w:sz w:val="19"/>
                 <w:szCs w:val="19"/>
               </w:rPr>
+              <w:t xml:space="preserve">Administration</w:t>
+            </w:r>
+          </w:p>
+        </w:tc>
+        <w:tc>
+          <w:tcPr>
+            <w:tcW w:type="dxa" w:w="7681"/>
+            <w:tcBorders>
+              <w:top w:val="single" w:color="9FB6CD" w:sz="4"/>
+              <w:left w:val="single" w:color="9FB6CD" w:sz="4"/>
+              <w:bottom w:val="single" w:color="9FB6CD" w:sz="4"/>
+              <w:right w:val="single" w:color="9FB6CD" w:sz="4"/>
+            </w:tcBorders>
+            <w:tcMar>
+              <w:top w:type="dxa" w:w="60"/>
+              <w:left w:type="dxa" w:w="100"/>
+              <w:bottom w:type="dxa" w:w="60"/>
+              <w:right w:type="dxa" w:w="100"/>
+            </w:tcMar>
+          </w:tcPr>
+          <w:p>
+            <w:pPr>
+              <w:spacing w:after="0"/>
+            </w:pPr>
+            <w:r>
+              <w:rPr>
+                <w:sz w:val="19"/>
+                <w:szCs w:val="19"/>
+              </w:rPr>
+              <w:t xml:space="preserve">Admins only from the command line (no API grants it); 2FA required; 404 for non-admins; re-authentication for actions; 30 reads / 10 actions per minute; no action on oneself or another admin; append-only audit log; the person sees each action in their security activity; no amounts ever shown</w:t>
+            </w:r>
+          </w:p>
+        </w:tc>
+      </w:tr>
+      <w:tr>
+        <w:trPr>
+          <w:cantSplit/>
+        </w:trPr>
+        <w:tc>
+          <w:tcPr>
+            <w:tcW w:type="dxa" w:w="1957"/>
+            <w:tcBorders>
+              <w:top w:val="single" w:color="9FB6CD" w:sz="4"/>
+              <w:left w:val="single" w:color="9FB6CD" w:sz="4"/>
+              <w:bottom w:val="single" w:color="9FB6CD" w:sz="4"/>
+              <w:right w:val="single" w:color="9FB6CD" w:sz="4"/>
+            </w:tcBorders>
+            <w:tcMar>
+              <w:top w:type="dxa" w:w="60"/>
+              <w:left w:type="dxa" w:w="100"/>
+              <w:bottom w:type="dxa" w:w="60"/>
+              <w:right w:type="dxa" w:w="100"/>
+            </w:tcMar>
+          </w:tcPr>
+          <w:p>
+            <w:pPr>
+              <w:spacing w:after="0"/>
+            </w:pPr>
+            <w:r>
+              <w:rPr>
+                <w:sz w:val="19"/>
+                <w:szCs w:val="19"/>
+              </w:rPr>
               <w:t xml:space="preserve">Abuse</w:t>
             </w:r>
           </w:p>
@@ -24485,6 +25429,248 @@
                 <w:szCs w:val="19"/>
               </w:rPr>
               <w:t xml:space="preserve">test_account.py</w:t>
+            </w:r>
+          </w:p>
+        </w:tc>
+      </w:tr>
+      <w:tr>
+        <w:trPr>
+          <w:cantSplit/>
+        </w:trPr>
+        <w:tc>
+          <w:tcPr>
+            <w:tcW w:type="dxa" w:w="2344"/>
+            <w:tcBorders>
+              <w:top w:val="single" w:color="9FB6CD" w:sz="4"/>
+              <w:left w:val="single" w:color="9FB6CD" w:sz="4"/>
+              <w:bottom w:val="single" w:color="9FB6CD" w:sz="4"/>
+              <w:right w:val="single" w:color="9FB6CD" w:sz="4"/>
+            </w:tcBorders>
+            <w:tcMar>
+              <w:top w:type="dxa" w:w="60"/>
+              <w:left w:type="dxa" w:w="100"/>
+              <w:bottom w:type="dxa" w:w="60"/>
+              <w:right w:type="dxa" w:w="100"/>
+            </w:tcMar>
+          </w:tcPr>
+          <w:p>
+            <w:pPr>
+              <w:spacing w:after="0"/>
+            </w:pPr>
+            <w:r>
+              <w:rPr>
+                <w:sz w:val="19"/>
+                <w:szCs w:val="19"/>
+              </w:rPr>
+              <w:t xml:space="preserve">Support and administration</w:t>
+            </w:r>
+          </w:p>
+        </w:tc>
+        <w:tc>
+          <w:tcPr>
+            <w:tcW w:type="dxa" w:w="1172"/>
+            <w:tcBorders>
+              <w:top w:val="single" w:color="9FB6CD" w:sz="4"/>
+              <w:left w:val="single" w:color="9FB6CD" w:sz="4"/>
+              <w:bottom w:val="single" w:color="9FB6CD" w:sz="4"/>
+              <w:right w:val="single" w:color="9FB6CD" w:sz="4"/>
+            </w:tcBorders>
+            <w:tcMar>
+              <w:top w:type="dxa" w:w="60"/>
+              <w:left w:type="dxa" w:w="100"/>
+              <w:bottom w:type="dxa" w:w="60"/>
+              <w:right w:type="dxa" w:w="100"/>
+            </w:tcMar>
+          </w:tcPr>
+          <w:p>
+            <w:pPr>
+              <w:spacing w:after="0"/>
+            </w:pPr>
+            <w:r>
+              <w:rPr>
+                <w:sz w:val="19"/>
+                <w:szCs w:val="19"/>
+              </w:rPr>
+              <w:t xml:space="preserve">UC-25–27</w:t>
+            </w:r>
+          </w:p>
+        </w:tc>
+        <w:tc>
+          <w:tcPr>
+            <w:tcW w:type="dxa" w:w="2995"/>
+            <w:tcBorders>
+              <w:top w:val="single" w:color="9FB6CD" w:sz="4"/>
+              <w:left w:val="single" w:color="9FB6CD" w:sz="4"/>
+              <w:bottom w:val="single" w:color="9FB6CD" w:sz="4"/>
+              <w:right w:val="single" w:color="9FB6CD" w:sz="4"/>
+            </w:tcBorders>
+            <w:tcMar>
+              <w:top w:type="dxa" w:w="60"/>
+              <w:left w:type="dxa" w:w="100"/>
+              <w:bottom w:type="dxa" w:w="60"/>
+              <w:right w:type="dxa" w:w="100"/>
+            </w:tcMar>
+          </w:tcPr>
+          <w:p>
+            <w:pPr>
+              <w:spacing w:after="0"/>
+            </w:pPr>
+            <w:r>
+              <w:rPr>
+                <w:sz w:val="19"/>
+                <w:szCs w:val="19"/>
+              </w:rPr>
+              <w:t xml:space="preserve">domain/admin, app/cli.py, dependencies.py (get_admin)</w:t>
+            </w:r>
+          </w:p>
+        </w:tc>
+        <w:tc>
+          <w:tcPr>
+            <w:tcW w:type="dxa" w:w="3127"/>
+            <w:tcBorders>
+              <w:top w:val="single" w:color="9FB6CD" w:sz="4"/>
+              <w:left w:val="single" w:color="9FB6CD" w:sz="4"/>
+              <w:bottom w:val="single" w:color="9FB6CD" w:sz="4"/>
+              <w:right w:val="single" w:color="9FB6CD" w:sz="4"/>
+            </w:tcBorders>
+            <w:tcMar>
+              <w:top w:type="dxa" w:w="60"/>
+              <w:left w:type="dxa" w:w="100"/>
+              <w:bottom w:type="dxa" w:w="60"/>
+              <w:right w:type="dxa" w:w="100"/>
+            </w:tcMar>
+          </w:tcPr>
+          <w:p>
+            <w:pPr>
+              <w:spacing w:after="0"/>
+            </w:pPr>
+            <w:r>
+              <w:rPr>
+                <w:sz w:val="19"/>
+                <w:szCs w:val="19"/>
+              </w:rPr>
+              <w:t xml:space="preserve">test_admin.py, test_admin_currencies.py</w:t>
+            </w:r>
+          </w:p>
+        </w:tc>
+      </w:tr>
+      <w:tr>
+        <w:trPr>
+          <w:cantSplit/>
+        </w:trPr>
+        <w:tc>
+          <w:tcPr>
+            <w:tcW w:type="dxa" w:w="2344"/>
+            <w:tcBorders>
+              <w:top w:val="single" w:color="9FB6CD" w:sz="4"/>
+              <w:left w:val="single" w:color="9FB6CD" w:sz="4"/>
+              <w:bottom w:val="single" w:color="9FB6CD" w:sz="4"/>
+              <w:right w:val="single" w:color="9FB6CD" w:sz="4"/>
+            </w:tcBorders>
+            <w:tcMar>
+              <w:top w:type="dxa" w:w="60"/>
+              <w:left w:type="dxa" w:w="100"/>
+              <w:bottom w:type="dxa" w:w="60"/>
+              <w:right w:type="dxa" w:w="100"/>
+            </w:tcMar>
+          </w:tcPr>
+          <w:p>
+            <w:pPr>
+              <w:spacing w:after="0"/>
+            </w:pPr>
+            <w:r>
+              <w:rPr>
+                <w:sz w:val="19"/>
+                <w:szCs w:val="19"/>
+              </w:rPr>
+              <w:t xml:space="preserve">Currencies managed as data</w:t>
+            </w:r>
+          </w:p>
+        </w:tc>
+        <w:tc>
+          <w:tcPr>
+            <w:tcW w:type="dxa" w:w="1172"/>
+            <w:tcBorders>
+              <w:top w:val="single" w:color="9FB6CD" w:sz="4"/>
+              <w:left w:val="single" w:color="9FB6CD" w:sz="4"/>
+              <w:bottom w:val="single" w:color="9FB6CD" w:sz="4"/>
+              <w:right w:val="single" w:color="9FB6CD" w:sz="4"/>
+            </w:tcBorders>
+            <w:tcMar>
+              <w:top w:type="dxa" w:w="60"/>
+              <w:left w:type="dxa" w:w="100"/>
+              <w:bottom w:type="dxa" w:w="60"/>
+              <w:right w:type="dxa" w:w="100"/>
+            </w:tcMar>
+          </w:tcPr>
+          <w:p>
+            <w:pPr>
+              <w:spacing w:after="0"/>
+            </w:pPr>
+            <w:r>
+              <w:rPr>
+                <w:sz w:val="19"/>
+                <w:szCs w:val="19"/>
+              </w:rPr>
+              <w:t xml:space="preserve">UC-26</w:t>
+            </w:r>
+          </w:p>
+        </w:tc>
+        <w:tc>
+          <w:tcPr>
+            <w:tcW w:type="dxa" w:w="2995"/>
+            <w:tcBorders>
+              <w:top w:val="single" w:color="9FB6CD" w:sz="4"/>
+              <w:left w:val="single" w:color="9FB6CD" w:sz="4"/>
+              <w:bottom w:val="single" w:color="9FB6CD" w:sz="4"/>
+              <w:right w:val="single" w:color="9FB6CD" w:sz="4"/>
+            </w:tcBorders>
+            <w:tcMar>
+              <w:top w:type="dxa" w:w="60"/>
+              <w:left w:type="dxa" w:w="100"/>
+              <w:bottom w:type="dxa" w:w="60"/>
+              <w:right w:type="dxa" w:w="100"/>
+            </w:tcMar>
+          </w:tcPr>
+          <w:p>
+            <w:pPr>
+              <w:spacing w:after="0"/>
+            </w:pPr>
+            <w:r>
+              <w:rPr>
+                <w:sz w:val="19"/>
+                <w:szCs w:val="19"/>
+              </w:rPr>
+              <w:t xml:space="preserve">domain/currency (catalog, client, service)</w:t>
+            </w:r>
+          </w:p>
+        </w:tc>
+        <w:tc>
+          <w:tcPr>
+            <w:tcW w:type="dxa" w:w="3127"/>
+            <w:tcBorders>
+              <w:top w:val="single" w:color="9FB6CD" w:sz="4"/>
+              <w:left w:val="single" w:color="9FB6CD" w:sz="4"/>
+              <w:bottom w:val="single" w:color="9FB6CD" w:sz="4"/>
+              <w:right w:val="single" w:color="9FB6CD" w:sz="4"/>
+            </w:tcBorders>
+            <w:tcMar>
+              <w:top w:type="dxa" w:w="60"/>
+              <w:left w:type="dxa" w:w="100"/>
+              <w:bottom w:type="dxa" w:w="60"/>
+              <w:right w:type="dxa" w:w="100"/>
+            </w:tcMar>
+          </w:tcPr>
+          <w:p>
+            <w:pPr>
+              <w:spacing w:after="0"/>
+            </w:pPr>
+            <w:r>
+              <w:rPr>
+                <w:sz w:val="19"/>
+                <w:szCs w:val="19"/>
+              </w:rPr>
+              <w:t xml:space="preserve">test_admin_currencies.py, test_currency.py</w:t>
             </w:r>
           </w:p>
         </w:tc>
@@ -24893,7 +26079,7 @@
         <w:spacing w:after="60"/>
       </w:pPr>
       <w:r>
-        <w:t xml:space="preserve">Users are mainly students in Turkey and the Arab world; the six supported currencies (TRY, USD, EUR, AED, SAR, QAR) cover them.</w:t>
+        <w:t xml:space="preserve">Users are mainly students in Turkey and the Arab world; the six starting currencies (TRY, USD, EUR, AED, SAR, QAR) cover them, and admins can add more.</w:t>
       </w:r>
     </w:p>
     <w:p>
@@ -26667,7 +27853,7 @@
         <w:sz w:val="16"/>
         <w:szCs w:val="16"/>
       </w:rPr>
-      <w:t xml:space="preserve">Budget Analysis · Software Architecture Document v2.0</w:t>
+      <w:t xml:space="preserve">Budget Analysis · Software Architecture Document v2.1</w:t>
     </w:r>
   </w:p>
 </w:hdr>

</xml_diff>

<commit_message>
docs: SAD 2.2 with features F1-F13
Co-Authored-By: Claude Opus 5.5 <noreply@anthropic.com>
Claude-Session: https://claude.ai/code/session_015dfvHwGRiy5swi2bxkwSyf
</commit_message>
<xml_diff>
--- a/docs/SAD.docx
+++ b/docs/SAD.docx
@@ -33,7 +33,7 @@
           <w:sz w:val="36"/>
           <w:szCs w:val="36"/>
         </w:rPr>
-        <w:t xml:space="preserve">(SAD) – Version 2.1</w:t>
+        <w:t xml:space="preserve">(SAD) – Version 2.2</w:t>
       </w:r>
     </w:p>
     <w:p>
@@ -319,7 +319,7 @@
                 <w:sz w:val="19"/>
                 <w:szCs w:val="19"/>
               </w:rPr>
-              <w:t xml:space="preserve">2.1 — as-built architecture</w:t>
+              <w:t xml:space="preserve">2.2 — as-built architecture</w:t>
             </w:r>
           </w:p>
         </w:tc>
@@ -382,7 +382,7 @@
                 <w:sz w:val="19"/>
                 <w:szCs w:val="19"/>
               </w:rPr>
-              <w:t xml:space="preserve">28 October 2026</w:t>
+              <w:t xml:space="preserve">31 October 2026</w:t>
             </w:r>
           </w:p>
         </w:tc>
@@ -445,7 +445,7 @@
                 <w:sz w:val="19"/>
                 <w:szCs w:val="19"/>
               </w:rPr>
-              <w:t xml:space="preserve">Current. Describes the system as it runs after roadmap phases 0–6h and the admin dashboard</w:t>
+              <w:t xml:space="preserve">Current. Describes the system as it runs after roadmap phases 0–6, the admin dashboard and the extra features F1–F13</w:t>
             </w:r>
           </w:p>
         </w:tc>
@@ -1164,6 +1164,127 @@
                 <w:szCs w:val="19"/>
               </w:rPr>
               <w:t xml:space="preserve">Admin dashboard (website only): platform admins granted from the command line, audit log, user support actions. Currencies moved from code into a table managed by admins. A currency the rates provider stops quoting no longer stops the others.</w:t>
+            </w:r>
+          </w:p>
+        </w:tc>
+      </w:tr>
+      <w:tr>
+        <w:trPr>
+          <w:cantSplit/>
+        </w:trPr>
+        <w:tc>
+          <w:tcPr>
+            <w:tcW w:type="dxa" w:w="963"/>
+            <w:tcBorders>
+              <w:top w:val="single" w:color="9FB6CD" w:sz="4"/>
+              <w:left w:val="single" w:color="9FB6CD" w:sz="4"/>
+              <w:bottom w:val="single" w:color="9FB6CD" w:sz="4"/>
+              <w:right w:val="single" w:color="9FB6CD" w:sz="4"/>
+            </w:tcBorders>
+            <w:tcMar>
+              <w:top w:type="dxa" w:w="60"/>
+              <w:left w:type="dxa" w:w="100"/>
+              <w:bottom w:type="dxa" w:w="60"/>
+              <w:right w:type="dxa" w:w="100"/>
+            </w:tcMar>
+          </w:tcPr>
+          <w:p>
+            <w:pPr>
+              <w:spacing w:after="0"/>
+            </w:pPr>
+            <w:r>
+              <w:rPr>
+                <w:sz w:val="19"/>
+                <w:szCs w:val="19"/>
+              </w:rPr>
+              <w:t xml:space="preserve">2.2</w:t>
+            </w:r>
+          </w:p>
+        </w:tc>
+        <w:tc>
+          <w:tcPr>
+            <w:tcW w:type="dxa" w:w="1325"/>
+            <w:tcBorders>
+              <w:top w:val="single" w:color="9FB6CD" w:sz="4"/>
+              <w:left w:val="single" w:color="9FB6CD" w:sz="4"/>
+              <w:bottom w:val="single" w:color="9FB6CD" w:sz="4"/>
+              <w:right w:val="single" w:color="9FB6CD" w:sz="4"/>
+            </w:tcBorders>
+            <w:tcMar>
+              <w:top w:type="dxa" w:w="60"/>
+              <w:left w:type="dxa" w:w="100"/>
+              <w:bottom w:type="dxa" w:w="60"/>
+              <w:right w:type="dxa" w:w="100"/>
+            </w:tcMar>
+          </w:tcPr>
+          <w:p>
+            <w:pPr>
+              <w:spacing w:after="0"/>
+            </w:pPr>
+            <w:r>
+              <w:rPr>
+                <w:sz w:val="19"/>
+                <w:szCs w:val="19"/>
+              </w:rPr>
+              <w:t xml:space="preserve">31 Oct 2026</w:t>
+            </w:r>
+          </w:p>
+        </w:tc>
+        <w:tc>
+          <w:tcPr>
+            <w:tcW w:type="dxa" w:w="1325"/>
+            <w:tcBorders>
+              <w:top w:val="single" w:color="9FB6CD" w:sz="4"/>
+              <w:left w:val="single" w:color="9FB6CD" w:sz="4"/>
+              <w:bottom w:val="single" w:color="9FB6CD" w:sz="4"/>
+              <w:right w:val="single" w:color="9FB6CD" w:sz="4"/>
+            </w:tcBorders>
+            <w:tcMar>
+              <w:top w:type="dxa" w:w="60"/>
+              <w:left w:type="dxa" w:w="100"/>
+              <w:bottom w:type="dxa" w:w="60"/>
+              <w:right w:type="dxa" w:w="100"/>
+            </w:tcMar>
+          </w:tcPr>
+          <w:p>
+            <w:pPr>
+              <w:spacing w:after="0"/>
+            </w:pPr>
+            <w:r>
+              <w:rPr>
+                <w:sz w:val="19"/>
+                <w:szCs w:val="19"/>
+              </w:rPr>
+              <w:t xml:space="preserve">M. Altaweel</w:t>
+            </w:r>
+          </w:p>
+        </w:tc>
+        <w:tc>
+          <w:tcPr>
+            <w:tcW w:type="dxa" w:w="6025"/>
+            <w:tcBorders>
+              <w:top w:val="single" w:color="9FB6CD" w:sz="4"/>
+              <w:left w:val="single" w:color="9FB6CD" w:sz="4"/>
+              <w:bottom w:val="single" w:color="9FB6CD" w:sz="4"/>
+              <w:right w:val="single" w:color="9FB6CD" w:sz="4"/>
+            </w:tcBorders>
+            <w:tcMar>
+              <w:top w:type="dxa" w:w="60"/>
+              <w:left w:type="dxa" w:w="100"/>
+              <w:bottom w:type="dxa" w:w="60"/>
+              <w:right w:type="dxa" w:w="100"/>
+            </w:tcMar>
+          </w:tcPr>
+          <w:p>
+            <w:pPr>
+              <w:spacing w:after="0"/>
+            </w:pPr>
+            <w:r>
+              <w:rPr>
+                <w:sz w:val="19"/>
+                <w:szCs w:val="19"/>
+              </w:rPr>
+              <w:t xml:space="preserve">Extra features F1–F13: recurring expenses, personal debts, income, month report, PDF and Excel reports, savings challenges, household budget, inflation view, voice and receipt entry, offline adding. A daily job (GitHub Actions) for recurring expenses, reminders and the month-report notification.</w:t>
             </w:r>
           </w:p>
         </w:tc>
@@ -7508,6 +7629,369 @@
           </w:p>
         </w:tc>
       </w:tr>
+      <w:tr>
+        <w:trPr>
+          <w:cantSplit/>
+        </w:trPr>
+        <w:tc>
+          <w:tcPr>
+            <w:tcW w:type="dxa" w:w="850"/>
+            <w:tcBorders>
+              <w:top w:val="single" w:color="9FB6CD" w:sz="4"/>
+              <w:left w:val="single" w:color="9FB6CD" w:sz="4"/>
+              <w:bottom w:val="single" w:color="9FB6CD" w:sz="4"/>
+              <w:right w:val="single" w:color="9FB6CD" w:sz="4"/>
+            </w:tcBorders>
+            <w:tcMar>
+              <w:top w:type="dxa" w:w="60"/>
+              <w:left w:type="dxa" w:w="100"/>
+              <w:bottom w:type="dxa" w:w="60"/>
+              <w:right w:type="dxa" w:w="100"/>
+            </w:tcMar>
+          </w:tcPr>
+          <w:p>
+            <w:pPr>
+              <w:spacing w:after="0"/>
+            </w:pPr>
+            <w:r>
+              <w:rPr>
+                <w:sz w:val="19"/>
+                <w:szCs w:val="19"/>
+              </w:rPr>
+              <w:t xml:space="preserve">AD-11</w:t>
+            </w:r>
+          </w:p>
+        </w:tc>
+        <w:tc>
+          <w:tcPr>
+            <w:tcW w:type="dxa" w:w="2834"/>
+            <w:tcBorders>
+              <w:top w:val="single" w:color="9FB6CD" w:sz="4"/>
+              <w:left w:val="single" w:color="9FB6CD" w:sz="4"/>
+              <w:bottom w:val="single" w:color="9FB6CD" w:sz="4"/>
+              <w:right w:val="single" w:color="9FB6CD" w:sz="4"/>
+            </w:tcBorders>
+            <w:tcMar>
+              <w:top w:type="dxa" w:w="60"/>
+              <w:left w:type="dxa" w:w="100"/>
+              <w:bottom w:type="dxa" w:w="60"/>
+              <w:right w:type="dxa" w:w="100"/>
+            </w:tcMar>
+          </w:tcPr>
+          <w:p>
+            <w:pPr>
+              <w:spacing w:after="0"/>
+            </w:pPr>
+            <w:r>
+              <w:rPr>
+                <w:sz w:val="19"/>
+                <w:szCs w:val="19"/>
+              </w:rPr>
+              <w:t xml:space="preserve">Scheduled work as one idempotent daily endpoint called by GitHub Actions</w:t>
+            </w:r>
+          </w:p>
+        </w:tc>
+        <w:tc>
+          <w:tcPr>
+            <w:tcW w:type="dxa" w:w="3118"/>
+            <w:tcBorders>
+              <w:top w:val="single" w:color="9FB6CD" w:sz="4"/>
+              <w:left w:val="single" w:color="9FB6CD" w:sz="4"/>
+              <w:bottom w:val="single" w:color="9FB6CD" w:sz="4"/>
+              <w:right w:val="single" w:color="9FB6CD" w:sz="4"/>
+            </w:tcBorders>
+            <w:tcMar>
+              <w:top w:type="dxa" w:w="60"/>
+              <w:left w:type="dxa" w:w="100"/>
+              <w:bottom w:type="dxa" w:w="60"/>
+              <w:right w:type="dxa" w:w="100"/>
+            </w:tcMar>
+          </w:tcPr>
+          <w:p>
+            <w:pPr>
+              <w:spacing w:after="0"/>
+            </w:pPr>
+            <w:r>
+              <w:rPr>
+                <w:sz w:val="19"/>
+                <w:szCs w:val="19"/>
+              </w:rPr>
+              <w:t xml:space="preserve">No worker to host or pay for on the free plan</w:t>
+            </w:r>
+          </w:p>
+        </w:tc>
+        <w:tc>
+          <w:tcPr>
+            <w:tcW w:type="dxa" w:w="2836"/>
+            <w:tcBorders>
+              <w:top w:val="single" w:color="9FB6CD" w:sz="4"/>
+              <w:left w:val="single" w:color="9FB6CD" w:sz="4"/>
+              <w:bottom w:val="single" w:color="9FB6CD" w:sz="4"/>
+              <w:right w:val="single" w:color="9FB6CD" w:sz="4"/>
+            </w:tcBorders>
+            <w:tcMar>
+              <w:top w:type="dxa" w:w="60"/>
+              <w:left w:type="dxa" w:w="100"/>
+              <w:bottom w:type="dxa" w:w="60"/>
+              <w:right w:type="dxa" w:w="100"/>
+            </w:tcMar>
+          </w:tcPr>
+          <w:p>
+            <w:pPr>
+              <w:spacing w:after="0"/>
+            </w:pPr>
+            <w:r>
+              <w:rPr>
+                <w:sz w:val="19"/>
+                <w:szCs w:val="19"/>
+              </w:rPr>
+              <w:t xml:space="preserve">Runs once a day; each step remembers what it already did</w:t>
+            </w:r>
+          </w:p>
+        </w:tc>
+      </w:tr>
+      <w:tr>
+        <w:trPr>
+          <w:cantSplit/>
+        </w:trPr>
+        <w:tc>
+          <w:tcPr>
+            <w:tcW w:type="dxa" w:w="850"/>
+            <w:tcBorders>
+              <w:top w:val="single" w:color="9FB6CD" w:sz="4"/>
+              <w:left w:val="single" w:color="9FB6CD" w:sz="4"/>
+              <w:bottom w:val="single" w:color="9FB6CD" w:sz="4"/>
+              <w:right w:val="single" w:color="9FB6CD" w:sz="4"/>
+            </w:tcBorders>
+            <w:tcMar>
+              <w:top w:type="dxa" w:w="60"/>
+              <w:left w:type="dxa" w:w="100"/>
+              <w:bottom w:type="dxa" w:w="60"/>
+              <w:right w:type="dxa" w:w="100"/>
+            </w:tcMar>
+          </w:tcPr>
+          <w:p>
+            <w:pPr>
+              <w:spacing w:after="0"/>
+            </w:pPr>
+            <w:r>
+              <w:rPr>
+                <w:sz w:val="19"/>
+                <w:szCs w:val="19"/>
+              </w:rPr>
+              <w:t xml:space="preserve">AD-12</w:t>
+            </w:r>
+          </w:p>
+        </w:tc>
+        <w:tc>
+          <w:tcPr>
+            <w:tcW w:type="dxa" w:w="2834"/>
+            <w:tcBorders>
+              <w:top w:val="single" w:color="9FB6CD" w:sz="4"/>
+              <w:left w:val="single" w:color="9FB6CD" w:sz="4"/>
+              <w:bottom w:val="single" w:color="9FB6CD" w:sz="4"/>
+              <w:right w:val="single" w:color="9FB6CD" w:sz="4"/>
+            </w:tcBorders>
+            <w:tcMar>
+              <w:top w:type="dxa" w:w="60"/>
+              <w:left w:type="dxa" w:w="100"/>
+              <w:bottom w:type="dxa" w:w="60"/>
+              <w:right w:type="dxa" w:w="100"/>
+            </w:tcMar>
+          </w:tcPr>
+          <w:p>
+            <w:pPr>
+              <w:spacing w:after="0"/>
+            </w:pPr>
+            <w:r>
+              <w:rPr>
+                <w:sz w:val="19"/>
+                <w:szCs w:val="19"/>
+              </w:rPr>
+              <w:t xml:space="preserve">Receipt reading on our own server (Tesseract), not a cloud vision API</w:t>
+            </w:r>
+          </w:p>
+        </w:tc>
+        <w:tc>
+          <w:tcPr>
+            <w:tcW w:type="dxa" w:w="3118"/>
+            <w:tcBorders>
+              <w:top w:val="single" w:color="9FB6CD" w:sz="4"/>
+              <w:left w:val="single" w:color="9FB6CD" w:sz="4"/>
+              <w:bottom w:val="single" w:color="9FB6CD" w:sz="4"/>
+              <w:right w:val="single" w:color="9FB6CD" w:sz="4"/>
+            </w:tcBorders>
+            <w:tcMar>
+              <w:top w:type="dxa" w:w="60"/>
+              <w:left w:type="dxa" w:w="100"/>
+              <w:bottom w:type="dxa" w:w="60"/>
+              <w:right w:type="dxa" w:w="100"/>
+            </w:tcMar>
+          </w:tcPr>
+          <w:p>
+            <w:pPr>
+              <w:spacing w:after="0"/>
+            </w:pPr>
+            <w:r>
+              <w:rPr>
+                <w:sz w:val="19"/>
+                <w:szCs w:val="19"/>
+              </w:rPr>
+              <w:t xml:space="preserve">Receipts stay private; no per-image cost</w:t>
+            </w:r>
+          </w:p>
+        </w:tc>
+        <w:tc>
+          <w:tcPr>
+            <w:tcW w:type="dxa" w:w="2836"/>
+            <w:tcBorders>
+              <w:top w:val="single" w:color="9FB6CD" w:sz="4"/>
+              <w:left w:val="single" w:color="9FB6CD" w:sz="4"/>
+              <w:bottom w:val="single" w:color="9FB6CD" w:sz="4"/>
+              <w:right w:val="single" w:color="9FB6CD" w:sz="4"/>
+            </w:tcBorders>
+            <w:tcMar>
+              <w:top w:type="dxa" w:w="60"/>
+              <w:left w:type="dxa" w:w="100"/>
+              <w:bottom w:type="dxa" w:w="60"/>
+              <w:right w:type="dxa" w:w="100"/>
+            </w:tcMar>
+          </w:tcPr>
+          <w:p>
+            <w:pPr>
+              <w:spacing w:after="0"/>
+            </w:pPr>
+            <w:r>
+              <w:rPr>
+                <w:sz w:val="19"/>
+                <w:szCs w:val="19"/>
+              </w:rPr>
+              <w:t xml:space="preserve">Less accurate on crumpled photos; the person always checks the form</w:t>
+            </w:r>
+          </w:p>
+        </w:tc>
+      </w:tr>
+      <w:tr>
+        <w:trPr>
+          <w:cantSplit/>
+        </w:trPr>
+        <w:tc>
+          <w:tcPr>
+            <w:tcW w:type="dxa" w:w="850"/>
+            <w:tcBorders>
+              <w:top w:val="single" w:color="9FB6CD" w:sz="4"/>
+              <w:left w:val="single" w:color="9FB6CD" w:sz="4"/>
+              <w:bottom w:val="single" w:color="9FB6CD" w:sz="4"/>
+              <w:right w:val="single" w:color="9FB6CD" w:sz="4"/>
+            </w:tcBorders>
+            <w:tcMar>
+              <w:top w:type="dxa" w:w="60"/>
+              <w:left w:type="dxa" w:w="100"/>
+              <w:bottom w:type="dxa" w:w="60"/>
+              <w:right w:type="dxa" w:w="100"/>
+            </w:tcMar>
+          </w:tcPr>
+          <w:p>
+            <w:pPr>
+              <w:spacing w:after="0"/>
+            </w:pPr>
+            <w:r>
+              <w:rPr>
+                <w:sz w:val="19"/>
+                <w:szCs w:val="19"/>
+              </w:rPr>
+              <w:t xml:space="preserve">AD-13</w:t>
+            </w:r>
+          </w:p>
+        </w:tc>
+        <w:tc>
+          <w:tcPr>
+            <w:tcW w:type="dxa" w:w="2834"/>
+            <w:tcBorders>
+              <w:top w:val="single" w:color="9FB6CD" w:sz="4"/>
+              <w:left w:val="single" w:color="9FB6CD" w:sz="4"/>
+              <w:bottom w:val="single" w:color="9FB6CD" w:sz="4"/>
+              <w:right w:val="single" w:color="9FB6CD" w:sz="4"/>
+            </w:tcBorders>
+            <w:tcMar>
+              <w:top w:type="dxa" w:w="60"/>
+              <w:left w:type="dxa" w:w="100"/>
+              <w:bottom w:type="dxa" w:w="60"/>
+              <w:right w:type="dxa" w:w="100"/>
+            </w:tcMar>
+          </w:tcPr>
+          <w:p>
+            <w:pPr>
+              <w:spacing w:after="0"/>
+            </w:pPr>
+            <w:r>
+              <w:rPr>
+                <w:sz w:val="19"/>
+                <w:szCs w:val="19"/>
+              </w:rPr>
+              <w:t xml:space="preserve">PDF reports drawn by ReportLab with our own Arabic shaping</w:t>
+            </w:r>
+          </w:p>
+        </w:tc>
+        <w:tc>
+          <w:tcPr>
+            <w:tcW w:type="dxa" w:w="3118"/>
+            <w:tcBorders>
+              <w:top w:val="single" w:color="9FB6CD" w:sz="4"/>
+              <w:left w:val="single" w:color="9FB6CD" w:sz="4"/>
+              <w:bottom w:val="single" w:color="9FB6CD" w:sz="4"/>
+              <w:right w:val="single" w:color="9FB6CD" w:sz="4"/>
+            </w:tcBorders>
+            <w:tcMar>
+              <w:top w:type="dxa" w:w="60"/>
+              <w:left w:type="dxa" w:w="100"/>
+              <w:bottom w:type="dxa" w:w="60"/>
+              <w:right w:type="dxa" w:w="100"/>
+            </w:tcMar>
+          </w:tcPr>
+          <w:p>
+            <w:pPr>
+              <w:spacing w:after="0"/>
+            </w:pPr>
+            <w:r>
+              <w:rPr>
+                <w:sz w:val="19"/>
+                <w:szCs w:val="19"/>
+              </w:rPr>
+              <w:t xml:space="preserve">No browser engine on the server</w:t>
+            </w:r>
+          </w:p>
+        </w:tc>
+        <w:tc>
+          <w:tcPr>
+            <w:tcW w:type="dxa" w:w="2836"/>
+            <w:tcBorders>
+              <w:top w:val="single" w:color="9FB6CD" w:sz="4"/>
+              <w:left w:val="single" w:color="9FB6CD" w:sz="4"/>
+              <w:bottom w:val="single" w:color="9FB6CD" w:sz="4"/>
+              <w:right w:val="single" w:color="9FB6CD" w:sz="4"/>
+            </w:tcBorders>
+            <w:tcMar>
+              <w:top w:type="dxa" w:w="60"/>
+              <w:left w:type="dxa" w:w="100"/>
+              <w:bottom w:type="dxa" w:w="60"/>
+              <w:right w:type="dxa" w:w="100"/>
+            </w:tcMar>
+          </w:tcPr>
+          <w:p>
+            <w:pPr>
+              <w:spacing w:after="0"/>
+            </w:pPr>
+            <w:r>
+              <w:rPr>
+                <w:sz w:val="19"/>
+                <w:szCs w:val="19"/>
+              </w:rPr>
+              <w:t xml:space="preserve">Single-line texts only; DejaVu Sans bundled with its licence</w:t>
+            </w:r>
+          </w:p>
+        </w:tc>
+      </w:tr>
     </w:tbl>
     <w:p>
       <w:pPr>
@@ -13324,6 +13808,1656 @@
                 <w:szCs w:val="19"/>
               </w:rPr>
               <w:t xml:space="preserve">Website /admin</w:t>
+            </w:r>
+          </w:p>
+        </w:tc>
+      </w:tr>
+      <w:tr>
+        <w:trPr>
+          <w:cantSplit/>
+        </w:trPr>
+        <w:tc>
+          <w:tcPr>
+            <w:tcW w:type="dxa" w:w="741"/>
+            <w:tcBorders>
+              <w:top w:val="single" w:color="9FB6CD" w:sz="4"/>
+              <w:left w:val="single" w:color="9FB6CD" w:sz="4"/>
+              <w:bottom w:val="single" w:color="9FB6CD" w:sz="4"/>
+              <w:right w:val="single" w:color="9FB6CD" w:sz="4"/>
+            </w:tcBorders>
+            <w:tcMar>
+              <w:top w:type="dxa" w:w="60"/>
+              <w:left w:type="dxa" w:w="100"/>
+              <w:bottom w:type="dxa" w:w="60"/>
+              <w:right w:type="dxa" w:w="100"/>
+            </w:tcMar>
+          </w:tcPr>
+          <w:p>
+            <w:pPr>
+              <w:spacing w:after="0"/>
+            </w:pPr>
+            <w:r>
+              <w:rPr>
+                <w:sz w:val="19"/>
+                <w:szCs w:val="19"/>
+              </w:rPr>
+              <w:t xml:space="preserve">UC-28</w:t>
+            </w:r>
+          </w:p>
+        </w:tc>
+        <w:tc>
+          <w:tcPr>
+            <w:tcW w:type="dxa" w:w="2594"/>
+            <w:tcBorders>
+              <w:top w:val="single" w:color="9FB6CD" w:sz="4"/>
+              <w:left w:val="single" w:color="9FB6CD" w:sz="4"/>
+              <w:bottom w:val="single" w:color="9FB6CD" w:sz="4"/>
+              <w:right w:val="single" w:color="9FB6CD" w:sz="4"/>
+            </w:tcBorders>
+            <w:tcMar>
+              <w:top w:type="dxa" w:w="60"/>
+              <w:left w:type="dxa" w:w="100"/>
+              <w:bottom w:type="dxa" w:w="60"/>
+              <w:right w:type="dxa" w:w="100"/>
+            </w:tcMar>
+          </w:tcPr>
+          <w:p>
+            <w:pPr>
+              <w:spacing w:after="0"/>
+            </w:pPr>
+            <w:r>
+              <w:rPr>
+                <w:sz w:val="19"/>
+                <w:szCs w:val="19"/>
+              </w:rPr>
+              <w:t xml:space="preserve">Set up recurring expenses and subscriptions (F1)</w:t>
+            </w:r>
+          </w:p>
+        </w:tc>
+        <w:tc>
+          <w:tcPr>
+            <w:tcW w:type="dxa" w:w="1359"/>
+            <w:tcBorders>
+              <w:top w:val="single" w:color="9FB6CD" w:sz="4"/>
+              <w:left w:val="single" w:color="9FB6CD" w:sz="4"/>
+              <w:bottom w:val="single" w:color="9FB6CD" w:sz="4"/>
+              <w:right w:val="single" w:color="9FB6CD" w:sz="4"/>
+            </w:tcBorders>
+            <w:tcMar>
+              <w:top w:type="dxa" w:w="60"/>
+              <w:left w:type="dxa" w:w="100"/>
+              <w:bottom w:type="dxa" w:w="60"/>
+              <w:right w:type="dxa" w:w="100"/>
+            </w:tcMar>
+          </w:tcPr>
+          <w:p>
+            <w:pPr>
+              <w:spacing w:after="0"/>
+            </w:pPr>
+            <w:r>
+              <w:rPr>
+                <w:sz w:val="19"/>
+                <w:szCs w:val="19"/>
+              </w:rPr>
+              <w:t xml:space="preserve">Student, daily job</w:t>
+            </w:r>
+          </w:p>
+        </w:tc>
+        <w:tc>
+          <w:tcPr>
+            <w:tcW w:type="dxa" w:w="2965"/>
+            <w:tcBorders>
+              <w:top w:val="single" w:color="9FB6CD" w:sz="4"/>
+              <w:left w:val="single" w:color="9FB6CD" w:sz="4"/>
+              <w:bottom w:val="single" w:color="9FB6CD" w:sz="4"/>
+              <w:right w:val="single" w:color="9FB6CD" w:sz="4"/>
+            </w:tcBorders>
+            <w:tcMar>
+              <w:top w:type="dxa" w:w="60"/>
+              <w:left w:type="dxa" w:w="100"/>
+              <w:bottom w:type="dxa" w:w="60"/>
+              <w:right w:type="dxa" w:w="100"/>
+            </w:tcMar>
+          </w:tcPr>
+          <w:p>
+            <w:pPr>
+              <w:spacing w:after="0"/>
+            </w:pPr>
+            <w:r>
+              <w:rPr>
+                <w:sz w:val="19"/>
+                <w:szCs w:val="19"/>
+              </w:rPr>
+              <w:t xml:space="preserve">/recurring; POST /internal/daily</w:t>
+            </w:r>
+          </w:p>
+        </w:tc>
+        <w:tc>
+          <w:tcPr>
+            <w:tcW w:type="dxa" w:w="1979"/>
+            <w:tcBorders>
+              <w:top w:val="single" w:color="9FB6CD" w:sz="4"/>
+              <w:left w:val="single" w:color="9FB6CD" w:sz="4"/>
+              <w:bottom w:val="single" w:color="9FB6CD" w:sz="4"/>
+              <w:right w:val="single" w:color="9FB6CD" w:sz="4"/>
+            </w:tcBorders>
+            <w:tcMar>
+              <w:top w:type="dxa" w:w="60"/>
+              <w:left w:type="dxa" w:w="100"/>
+              <w:bottom w:type="dxa" w:w="60"/>
+              <w:right w:type="dxa" w:w="100"/>
+            </w:tcMar>
+          </w:tcPr>
+          <w:p>
+            <w:pPr>
+              <w:spacing w:after="0"/>
+            </w:pPr>
+            <w:r>
+              <w:rPr>
+                <w:sz w:val="19"/>
+                <w:szCs w:val="19"/>
+              </w:rPr>
+              <w:t xml:space="preserve">Expenses › Recurring</w:t>
+            </w:r>
+          </w:p>
+        </w:tc>
+      </w:tr>
+      <w:tr>
+        <w:trPr>
+          <w:cantSplit/>
+        </w:trPr>
+        <w:tc>
+          <w:tcPr>
+            <w:tcW w:type="dxa" w:w="741"/>
+            <w:tcBorders>
+              <w:top w:val="single" w:color="9FB6CD" w:sz="4"/>
+              <w:left w:val="single" w:color="9FB6CD" w:sz="4"/>
+              <w:bottom w:val="single" w:color="9FB6CD" w:sz="4"/>
+              <w:right w:val="single" w:color="9FB6CD" w:sz="4"/>
+            </w:tcBorders>
+            <w:tcMar>
+              <w:top w:type="dxa" w:w="60"/>
+              <w:left w:type="dxa" w:w="100"/>
+              <w:bottom w:type="dxa" w:w="60"/>
+              <w:right w:type="dxa" w:w="100"/>
+            </w:tcMar>
+          </w:tcPr>
+          <w:p>
+            <w:pPr>
+              <w:spacing w:after="0"/>
+            </w:pPr>
+            <w:r>
+              <w:rPr>
+                <w:sz w:val="19"/>
+                <w:szCs w:val="19"/>
+              </w:rPr>
+              <w:t xml:space="preserve">UC-29</w:t>
+            </w:r>
+          </w:p>
+        </w:tc>
+        <w:tc>
+          <w:tcPr>
+            <w:tcW w:type="dxa" w:w="2594"/>
+            <w:tcBorders>
+              <w:top w:val="single" w:color="9FB6CD" w:sz="4"/>
+              <w:left w:val="single" w:color="9FB6CD" w:sz="4"/>
+              <w:bottom w:val="single" w:color="9FB6CD" w:sz="4"/>
+              <w:right w:val="single" w:color="9FB6CD" w:sz="4"/>
+            </w:tcBorders>
+            <w:tcMar>
+              <w:top w:type="dxa" w:w="60"/>
+              <w:left w:type="dxa" w:w="100"/>
+              <w:bottom w:type="dxa" w:w="60"/>
+              <w:right w:type="dxa" w:w="100"/>
+            </w:tcMar>
+          </w:tcPr>
+          <w:p>
+            <w:pPr>
+              <w:spacing w:after="0"/>
+            </w:pPr>
+            <w:r>
+              <w:rPr>
+                <w:sz w:val="19"/>
+                <w:szCs w:val="19"/>
+              </w:rPr>
+              <w:t xml:space="preserve">Track money lent and borrowed, paid back in parts (F2)</w:t>
+            </w:r>
+          </w:p>
+        </w:tc>
+        <w:tc>
+          <w:tcPr>
+            <w:tcW w:type="dxa" w:w="1359"/>
+            <w:tcBorders>
+              <w:top w:val="single" w:color="9FB6CD" w:sz="4"/>
+              <w:left w:val="single" w:color="9FB6CD" w:sz="4"/>
+              <w:bottom w:val="single" w:color="9FB6CD" w:sz="4"/>
+              <w:right w:val="single" w:color="9FB6CD" w:sz="4"/>
+            </w:tcBorders>
+            <w:tcMar>
+              <w:top w:type="dxa" w:w="60"/>
+              <w:left w:type="dxa" w:w="100"/>
+              <w:bottom w:type="dxa" w:w="60"/>
+              <w:right w:type="dxa" w:w="100"/>
+            </w:tcMar>
+          </w:tcPr>
+          <w:p>
+            <w:pPr>
+              <w:spacing w:after="0"/>
+            </w:pPr>
+            <w:r>
+              <w:rPr>
+                <w:sz w:val="19"/>
+                <w:szCs w:val="19"/>
+              </w:rPr>
+              <w:t xml:space="preserve">Student</w:t>
+            </w:r>
+          </w:p>
+        </w:tc>
+        <w:tc>
+          <w:tcPr>
+            <w:tcW w:type="dxa" w:w="2965"/>
+            <w:tcBorders>
+              <w:top w:val="single" w:color="9FB6CD" w:sz="4"/>
+              <w:left w:val="single" w:color="9FB6CD" w:sz="4"/>
+              <w:bottom w:val="single" w:color="9FB6CD" w:sz="4"/>
+              <w:right w:val="single" w:color="9FB6CD" w:sz="4"/>
+            </w:tcBorders>
+            <w:tcMar>
+              <w:top w:type="dxa" w:w="60"/>
+              <w:left w:type="dxa" w:w="100"/>
+              <w:bottom w:type="dxa" w:w="60"/>
+              <w:right w:type="dxa" w:w="100"/>
+            </w:tcMar>
+          </w:tcPr>
+          <w:p>
+            <w:pPr>
+              <w:spacing w:after="0"/>
+            </w:pPr>
+            <w:r>
+              <w:rPr>
+                <w:sz w:val="19"/>
+                <w:szCs w:val="19"/>
+              </w:rPr>
+              <w:t xml:space="preserve">/debts, /debts/{id}/payments, /settle</w:t>
+            </w:r>
+          </w:p>
+        </w:tc>
+        <w:tc>
+          <w:tcPr>
+            <w:tcW w:type="dxa" w:w="1979"/>
+            <w:tcBorders>
+              <w:top w:val="single" w:color="9FB6CD" w:sz="4"/>
+              <w:left w:val="single" w:color="9FB6CD" w:sz="4"/>
+              <w:bottom w:val="single" w:color="9FB6CD" w:sz="4"/>
+              <w:right w:val="single" w:color="9FB6CD" w:sz="4"/>
+            </w:tcBorders>
+            <w:tcMar>
+              <w:top w:type="dxa" w:w="60"/>
+              <w:left w:type="dxa" w:w="100"/>
+              <w:bottom w:type="dxa" w:w="60"/>
+              <w:right w:type="dxa" w:w="100"/>
+            </w:tcMar>
+          </w:tcPr>
+          <w:p>
+            <w:pPr>
+              <w:spacing w:after="0"/>
+            </w:pPr>
+            <w:r>
+              <w:rPr>
+                <w:sz w:val="19"/>
+                <w:szCs w:val="19"/>
+              </w:rPr>
+              <w:t xml:space="preserve">Groups › Debts</w:t>
+            </w:r>
+          </w:p>
+        </w:tc>
+      </w:tr>
+      <w:tr>
+        <w:trPr>
+          <w:cantSplit/>
+        </w:trPr>
+        <w:tc>
+          <w:tcPr>
+            <w:tcW w:type="dxa" w:w="741"/>
+            <w:tcBorders>
+              <w:top w:val="single" w:color="9FB6CD" w:sz="4"/>
+              <w:left w:val="single" w:color="9FB6CD" w:sz="4"/>
+              <w:bottom w:val="single" w:color="9FB6CD" w:sz="4"/>
+              <w:right w:val="single" w:color="9FB6CD" w:sz="4"/>
+            </w:tcBorders>
+            <w:tcMar>
+              <w:top w:type="dxa" w:w="60"/>
+              <w:left w:type="dxa" w:w="100"/>
+              <w:bottom w:type="dxa" w:w="60"/>
+              <w:right w:type="dxa" w:w="100"/>
+            </w:tcMar>
+          </w:tcPr>
+          <w:p>
+            <w:pPr>
+              <w:spacing w:after="0"/>
+            </w:pPr>
+            <w:r>
+              <w:rPr>
+                <w:sz w:val="19"/>
+                <w:szCs w:val="19"/>
+              </w:rPr>
+              <w:t xml:space="preserve">UC-30</w:t>
+            </w:r>
+          </w:p>
+        </w:tc>
+        <w:tc>
+          <w:tcPr>
+            <w:tcW w:type="dxa" w:w="2594"/>
+            <w:tcBorders>
+              <w:top w:val="single" w:color="9FB6CD" w:sz="4"/>
+              <w:left w:val="single" w:color="9FB6CD" w:sz="4"/>
+              <w:bottom w:val="single" w:color="9FB6CD" w:sz="4"/>
+              <w:right w:val="single" w:color="9FB6CD" w:sz="4"/>
+            </w:tcBorders>
+            <w:tcMar>
+              <w:top w:type="dxa" w:w="60"/>
+              <w:left w:type="dxa" w:w="100"/>
+              <w:bottom w:type="dxa" w:w="60"/>
+              <w:right w:type="dxa" w:w="100"/>
+            </w:tcMar>
+          </w:tcPr>
+          <w:p>
+            <w:pPr>
+              <w:spacing w:after="0"/>
+            </w:pPr>
+            <w:r>
+              <w:rPr>
+                <w:sz w:val="19"/>
+                <w:szCs w:val="19"/>
+              </w:rPr>
+              <w:t xml:space="preserve">Record income and see what is left (F3)</w:t>
+            </w:r>
+          </w:p>
+        </w:tc>
+        <w:tc>
+          <w:tcPr>
+            <w:tcW w:type="dxa" w:w="1359"/>
+            <w:tcBorders>
+              <w:top w:val="single" w:color="9FB6CD" w:sz="4"/>
+              <w:left w:val="single" w:color="9FB6CD" w:sz="4"/>
+              <w:bottom w:val="single" w:color="9FB6CD" w:sz="4"/>
+              <w:right w:val="single" w:color="9FB6CD" w:sz="4"/>
+            </w:tcBorders>
+            <w:tcMar>
+              <w:top w:type="dxa" w:w="60"/>
+              <w:left w:type="dxa" w:w="100"/>
+              <w:bottom w:type="dxa" w:w="60"/>
+              <w:right w:type="dxa" w:w="100"/>
+            </w:tcMar>
+          </w:tcPr>
+          <w:p>
+            <w:pPr>
+              <w:spacing w:after="0"/>
+            </w:pPr>
+            <w:r>
+              <w:rPr>
+                <w:sz w:val="19"/>
+                <w:szCs w:val="19"/>
+              </w:rPr>
+              <w:t xml:space="preserve">Student</w:t>
+            </w:r>
+          </w:p>
+        </w:tc>
+        <w:tc>
+          <w:tcPr>
+            <w:tcW w:type="dxa" w:w="2965"/>
+            <w:tcBorders>
+              <w:top w:val="single" w:color="9FB6CD" w:sz="4"/>
+              <w:left w:val="single" w:color="9FB6CD" w:sz="4"/>
+              <w:bottom w:val="single" w:color="9FB6CD" w:sz="4"/>
+              <w:right w:val="single" w:color="9FB6CD" w:sz="4"/>
+            </w:tcBorders>
+            <w:tcMar>
+              <w:top w:type="dxa" w:w="60"/>
+              <w:left w:type="dxa" w:w="100"/>
+              <w:bottom w:type="dxa" w:w="60"/>
+              <w:right w:type="dxa" w:w="100"/>
+            </w:tcMar>
+          </w:tcPr>
+          <w:p>
+            <w:pPr>
+              <w:spacing w:after="0"/>
+            </w:pPr>
+            <w:r>
+              <w:rPr>
+                <w:sz w:val="19"/>
+                <w:szCs w:val="19"/>
+              </w:rPr>
+              <w:t xml:space="preserve">/incomes/{month}, /incomes, /copy-previous</w:t>
+            </w:r>
+          </w:p>
+        </w:tc>
+        <w:tc>
+          <w:tcPr>
+            <w:tcW w:type="dxa" w:w="1979"/>
+            <w:tcBorders>
+              <w:top w:val="single" w:color="9FB6CD" w:sz="4"/>
+              <w:left w:val="single" w:color="9FB6CD" w:sz="4"/>
+              <w:bottom w:val="single" w:color="9FB6CD" w:sz="4"/>
+              <w:right w:val="single" w:color="9FB6CD" w:sz="4"/>
+            </w:tcBorders>
+            <w:tcMar>
+              <w:top w:type="dxa" w:w="60"/>
+              <w:left w:type="dxa" w:w="100"/>
+              <w:bottom w:type="dxa" w:w="60"/>
+              <w:right w:type="dxa" w:w="100"/>
+            </w:tcMar>
+          </w:tcPr>
+          <w:p>
+            <w:pPr>
+              <w:spacing w:after="0"/>
+            </w:pPr>
+            <w:r>
+              <w:rPr>
+                <w:sz w:val="19"/>
+                <w:szCs w:val="19"/>
+              </w:rPr>
+              <w:t xml:space="preserve">Budget › Income</w:t>
+            </w:r>
+          </w:p>
+        </w:tc>
+      </w:tr>
+      <w:tr>
+        <w:trPr>
+          <w:cantSplit/>
+        </w:trPr>
+        <w:tc>
+          <w:tcPr>
+            <w:tcW w:type="dxa" w:w="741"/>
+            <w:tcBorders>
+              <w:top w:val="single" w:color="9FB6CD" w:sz="4"/>
+              <w:left w:val="single" w:color="9FB6CD" w:sz="4"/>
+              <w:bottom w:val="single" w:color="9FB6CD" w:sz="4"/>
+              <w:right w:val="single" w:color="9FB6CD" w:sz="4"/>
+            </w:tcBorders>
+            <w:tcMar>
+              <w:top w:type="dxa" w:w="60"/>
+              <w:left w:type="dxa" w:w="100"/>
+              <w:bottom w:type="dxa" w:w="60"/>
+              <w:right w:type="dxa" w:w="100"/>
+            </w:tcMar>
+          </w:tcPr>
+          <w:p>
+            <w:pPr>
+              <w:spacing w:after="0"/>
+            </w:pPr>
+            <w:r>
+              <w:rPr>
+                <w:sz w:val="19"/>
+                <w:szCs w:val="19"/>
+              </w:rPr>
+              <w:t xml:space="preserve">UC-31</w:t>
+            </w:r>
+          </w:p>
+        </w:tc>
+        <w:tc>
+          <w:tcPr>
+            <w:tcW w:type="dxa" w:w="2594"/>
+            <w:tcBorders>
+              <w:top w:val="single" w:color="9FB6CD" w:sz="4"/>
+              <w:left w:val="single" w:color="9FB6CD" w:sz="4"/>
+              <w:bottom w:val="single" w:color="9FB6CD" w:sz="4"/>
+              <w:right w:val="single" w:color="9FB6CD" w:sz="4"/>
+            </w:tcBorders>
+            <w:tcMar>
+              <w:top w:type="dxa" w:w="60"/>
+              <w:left w:type="dxa" w:w="100"/>
+              <w:bottom w:type="dxa" w:w="60"/>
+              <w:right w:type="dxa" w:w="100"/>
+            </w:tcMar>
+          </w:tcPr>
+          <w:p>
+            <w:pPr>
+              <w:spacing w:after="0"/>
+            </w:pPr>
+            <w:r>
+              <w:rPr>
+                <w:sz w:val="19"/>
+                <w:szCs w:val="19"/>
+              </w:rPr>
+              <w:t xml:space="preserve">See the month report and share it (F4)</w:t>
+            </w:r>
+          </w:p>
+        </w:tc>
+        <w:tc>
+          <w:tcPr>
+            <w:tcW w:type="dxa" w:w="1359"/>
+            <w:tcBorders>
+              <w:top w:val="single" w:color="9FB6CD" w:sz="4"/>
+              <w:left w:val="single" w:color="9FB6CD" w:sz="4"/>
+              <w:bottom w:val="single" w:color="9FB6CD" w:sz="4"/>
+              <w:right w:val="single" w:color="9FB6CD" w:sz="4"/>
+            </w:tcBorders>
+            <w:tcMar>
+              <w:top w:type="dxa" w:w="60"/>
+              <w:left w:type="dxa" w:w="100"/>
+              <w:bottom w:type="dxa" w:w="60"/>
+              <w:right w:type="dxa" w:w="100"/>
+            </w:tcMar>
+          </w:tcPr>
+          <w:p>
+            <w:pPr>
+              <w:spacing w:after="0"/>
+            </w:pPr>
+            <w:r>
+              <w:rPr>
+                <w:sz w:val="19"/>
+                <w:szCs w:val="19"/>
+              </w:rPr>
+              <w:t xml:space="preserve">Student, push service</w:t>
+            </w:r>
+          </w:p>
+        </w:tc>
+        <w:tc>
+          <w:tcPr>
+            <w:tcW w:type="dxa" w:w="2965"/>
+            <w:tcBorders>
+              <w:top w:val="single" w:color="9FB6CD" w:sz="4"/>
+              <w:left w:val="single" w:color="9FB6CD" w:sz="4"/>
+              <w:bottom w:val="single" w:color="9FB6CD" w:sz="4"/>
+              <w:right w:val="single" w:color="9FB6CD" w:sz="4"/>
+            </w:tcBorders>
+            <w:tcMar>
+              <w:top w:type="dxa" w:w="60"/>
+              <w:left w:type="dxa" w:w="100"/>
+              <w:bottom w:type="dxa" w:w="60"/>
+              <w:right w:type="dxa" w:w="100"/>
+            </w:tcMar>
+          </w:tcPr>
+          <w:p>
+            <w:pPr>
+              <w:spacing w:after="0"/>
+            </w:pPr>
+            <w:r>
+              <w:rPr>
+                <w:sz w:val="19"/>
+                <w:szCs w:val="19"/>
+              </w:rPr>
+              <w:t xml:space="preserve">GET /reports/{month}/wrapped</w:t>
+            </w:r>
+          </w:p>
+        </w:tc>
+        <w:tc>
+          <w:tcPr>
+            <w:tcW w:type="dxa" w:w="1979"/>
+            <w:tcBorders>
+              <w:top w:val="single" w:color="9FB6CD" w:sz="4"/>
+              <w:left w:val="single" w:color="9FB6CD" w:sz="4"/>
+              <w:bottom w:val="single" w:color="9FB6CD" w:sz="4"/>
+              <w:right w:val="single" w:color="9FB6CD" w:sz="4"/>
+            </w:tcBorders>
+            <w:tcMar>
+              <w:top w:type="dxa" w:w="60"/>
+              <w:left w:type="dxa" w:w="100"/>
+              <w:bottom w:type="dxa" w:w="60"/>
+              <w:right w:type="dxa" w:w="100"/>
+            </w:tcMar>
+          </w:tcPr>
+          <w:p>
+            <w:pPr>
+              <w:spacing w:after="0"/>
+            </w:pPr>
+            <w:r>
+              <w:rPr>
+                <w:sz w:val="19"/>
+                <w:szCs w:val="19"/>
+              </w:rPr>
+              <w:t xml:space="preserve">Budget › Month report</w:t>
+            </w:r>
+          </w:p>
+        </w:tc>
+      </w:tr>
+      <w:tr>
+        <w:trPr>
+          <w:cantSplit/>
+        </w:trPr>
+        <w:tc>
+          <w:tcPr>
+            <w:tcW w:type="dxa" w:w="741"/>
+            <w:tcBorders>
+              <w:top w:val="single" w:color="9FB6CD" w:sz="4"/>
+              <w:left w:val="single" w:color="9FB6CD" w:sz="4"/>
+              <w:bottom w:val="single" w:color="9FB6CD" w:sz="4"/>
+              <w:right w:val="single" w:color="9FB6CD" w:sz="4"/>
+            </w:tcBorders>
+            <w:tcMar>
+              <w:top w:type="dxa" w:w="60"/>
+              <w:left w:type="dxa" w:w="100"/>
+              <w:bottom w:type="dxa" w:w="60"/>
+              <w:right w:type="dxa" w:w="100"/>
+            </w:tcMar>
+          </w:tcPr>
+          <w:p>
+            <w:pPr>
+              <w:spacing w:after="0"/>
+            </w:pPr>
+            <w:r>
+              <w:rPr>
+                <w:sz w:val="19"/>
+                <w:szCs w:val="19"/>
+              </w:rPr>
+              <w:t xml:space="preserve">UC-32</w:t>
+            </w:r>
+          </w:p>
+        </w:tc>
+        <w:tc>
+          <w:tcPr>
+            <w:tcW w:type="dxa" w:w="2594"/>
+            <w:tcBorders>
+              <w:top w:val="single" w:color="9FB6CD" w:sz="4"/>
+              <w:left w:val="single" w:color="9FB6CD" w:sz="4"/>
+              <w:bottom w:val="single" w:color="9FB6CD" w:sz="4"/>
+              <w:right w:val="single" w:color="9FB6CD" w:sz="4"/>
+            </w:tcBorders>
+            <w:tcMar>
+              <w:top w:type="dxa" w:w="60"/>
+              <w:left w:type="dxa" w:w="100"/>
+              <w:bottom w:type="dxa" w:w="60"/>
+              <w:right w:type="dxa" w:w="100"/>
+            </w:tcMar>
+          </w:tcPr>
+          <w:p>
+            <w:pPr>
+              <w:spacing w:after="0"/>
+            </w:pPr>
+            <w:r>
+              <w:rPr>
+                <w:sz w:val="19"/>
+                <w:szCs w:val="19"/>
+              </w:rPr>
+              <w:t xml:space="preserve">Download a month or year as PDF or Excel (F5)</w:t>
+            </w:r>
+          </w:p>
+        </w:tc>
+        <w:tc>
+          <w:tcPr>
+            <w:tcW w:type="dxa" w:w="1359"/>
+            <w:tcBorders>
+              <w:top w:val="single" w:color="9FB6CD" w:sz="4"/>
+              <w:left w:val="single" w:color="9FB6CD" w:sz="4"/>
+              <w:bottom w:val="single" w:color="9FB6CD" w:sz="4"/>
+              <w:right w:val="single" w:color="9FB6CD" w:sz="4"/>
+            </w:tcBorders>
+            <w:tcMar>
+              <w:top w:type="dxa" w:w="60"/>
+              <w:left w:type="dxa" w:w="100"/>
+              <w:bottom w:type="dxa" w:w="60"/>
+              <w:right w:type="dxa" w:w="100"/>
+            </w:tcMar>
+          </w:tcPr>
+          <w:p>
+            <w:pPr>
+              <w:spacing w:after="0"/>
+            </w:pPr>
+            <w:r>
+              <w:rPr>
+                <w:sz w:val="19"/>
+                <w:szCs w:val="19"/>
+              </w:rPr>
+              <w:t xml:space="preserve">Student</w:t>
+            </w:r>
+          </w:p>
+        </w:tc>
+        <w:tc>
+          <w:tcPr>
+            <w:tcW w:type="dxa" w:w="2965"/>
+            <w:tcBorders>
+              <w:top w:val="single" w:color="9FB6CD" w:sz="4"/>
+              <w:left w:val="single" w:color="9FB6CD" w:sz="4"/>
+              <w:bottom w:val="single" w:color="9FB6CD" w:sz="4"/>
+              <w:right w:val="single" w:color="9FB6CD" w:sz="4"/>
+            </w:tcBorders>
+            <w:tcMar>
+              <w:top w:type="dxa" w:w="60"/>
+              <w:left w:type="dxa" w:w="100"/>
+              <w:bottom w:type="dxa" w:w="60"/>
+              <w:right w:type="dxa" w:w="100"/>
+            </w:tcMar>
+          </w:tcPr>
+          <w:p>
+            <w:pPr>
+              <w:spacing w:after="0"/>
+            </w:pPr>
+            <w:r>
+              <w:rPr>
+                <w:sz w:val="19"/>
+                <w:szCs w:val="19"/>
+              </w:rPr>
+              <w:t xml:space="preserve">GET /reports/{month}/file, /reports/year/{year}/file</w:t>
+            </w:r>
+          </w:p>
+        </w:tc>
+        <w:tc>
+          <w:tcPr>
+            <w:tcW w:type="dxa" w:w="1979"/>
+            <w:tcBorders>
+              <w:top w:val="single" w:color="9FB6CD" w:sz="4"/>
+              <w:left w:val="single" w:color="9FB6CD" w:sz="4"/>
+              <w:bottom w:val="single" w:color="9FB6CD" w:sz="4"/>
+              <w:right w:val="single" w:color="9FB6CD" w:sz="4"/>
+            </w:tcBorders>
+            <w:tcMar>
+              <w:top w:type="dxa" w:w="60"/>
+              <w:left w:type="dxa" w:w="100"/>
+              <w:bottom w:type="dxa" w:w="60"/>
+              <w:right w:type="dxa" w:w="100"/>
+            </w:tcMar>
+          </w:tcPr>
+          <w:p>
+            <w:pPr>
+              <w:spacing w:after="0"/>
+            </w:pPr>
+            <w:r>
+              <w:rPr>
+                <w:sz w:val="19"/>
+                <w:szCs w:val="19"/>
+              </w:rPr>
+              <w:t xml:space="preserve">Month report › Download</w:t>
+            </w:r>
+          </w:p>
+        </w:tc>
+      </w:tr>
+      <w:tr>
+        <w:trPr>
+          <w:cantSplit/>
+        </w:trPr>
+        <w:tc>
+          <w:tcPr>
+            <w:tcW w:type="dxa" w:w="741"/>
+            <w:tcBorders>
+              <w:top w:val="single" w:color="9FB6CD" w:sz="4"/>
+              <w:left w:val="single" w:color="9FB6CD" w:sz="4"/>
+              <w:bottom w:val="single" w:color="9FB6CD" w:sz="4"/>
+              <w:right w:val="single" w:color="9FB6CD" w:sz="4"/>
+            </w:tcBorders>
+            <w:tcMar>
+              <w:top w:type="dxa" w:w="60"/>
+              <w:left w:type="dxa" w:w="100"/>
+              <w:bottom w:type="dxa" w:w="60"/>
+              <w:right w:type="dxa" w:w="100"/>
+            </w:tcMar>
+          </w:tcPr>
+          <w:p>
+            <w:pPr>
+              <w:spacing w:after="0"/>
+            </w:pPr>
+            <w:r>
+              <w:rPr>
+                <w:sz w:val="19"/>
+                <w:szCs w:val="19"/>
+              </w:rPr>
+              <w:t xml:space="preserve">UC-33</w:t>
+            </w:r>
+          </w:p>
+        </w:tc>
+        <w:tc>
+          <w:tcPr>
+            <w:tcW w:type="dxa" w:w="2594"/>
+            <w:tcBorders>
+              <w:top w:val="single" w:color="9FB6CD" w:sz="4"/>
+              <w:left w:val="single" w:color="9FB6CD" w:sz="4"/>
+              <w:bottom w:val="single" w:color="9FB6CD" w:sz="4"/>
+              <w:right w:val="single" w:color="9FB6CD" w:sz="4"/>
+            </w:tcBorders>
+            <w:tcMar>
+              <w:top w:type="dxa" w:w="60"/>
+              <w:left w:type="dxa" w:w="100"/>
+              <w:bottom w:type="dxa" w:w="60"/>
+              <w:right w:type="dxa" w:w="100"/>
+            </w:tcMar>
+          </w:tcPr>
+          <w:p>
+            <w:pPr>
+              <w:spacing w:after="0"/>
+            </w:pPr>
+            <w:r>
+              <w:rPr>
+                <w:sz w:val="19"/>
+                <w:szCs w:val="19"/>
+              </w:rPr>
+              <w:t xml:space="preserve">Run savings challenges, alone or with a group (F6)</w:t>
+            </w:r>
+          </w:p>
+        </w:tc>
+        <w:tc>
+          <w:tcPr>
+            <w:tcW w:type="dxa" w:w="1359"/>
+            <w:tcBorders>
+              <w:top w:val="single" w:color="9FB6CD" w:sz="4"/>
+              <w:left w:val="single" w:color="9FB6CD" w:sz="4"/>
+              <w:bottom w:val="single" w:color="9FB6CD" w:sz="4"/>
+              <w:right w:val="single" w:color="9FB6CD" w:sz="4"/>
+            </w:tcBorders>
+            <w:tcMar>
+              <w:top w:type="dxa" w:w="60"/>
+              <w:left w:type="dxa" w:w="100"/>
+              <w:bottom w:type="dxa" w:w="60"/>
+              <w:right w:type="dxa" w:w="100"/>
+            </w:tcMar>
+          </w:tcPr>
+          <w:p>
+            <w:pPr>
+              <w:spacing w:after="0"/>
+            </w:pPr>
+            <w:r>
+              <w:rPr>
+                <w:sz w:val="19"/>
+                <w:szCs w:val="19"/>
+              </w:rPr>
+              <w:t xml:space="preserve">Student, group member</w:t>
+            </w:r>
+          </w:p>
+        </w:tc>
+        <w:tc>
+          <w:tcPr>
+            <w:tcW w:type="dxa" w:w="2965"/>
+            <w:tcBorders>
+              <w:top w:val="single" w:color="9FB6CD" w:sz="4"/>
+              <w:left w:val="single" w:color="9FB6CD" w:sz="4"/>
+              <w:bottom w:val="single" w:color="9FB6CD" w:sz="4"/>
+              <w:right w:val="single" w:color="9FB6CD" w:sz="4"/>
+            </w:tcBorders>
+            <w:tcMar>
+              <w:top w:type="dxa" w:w="60"/>
+              <w:left w:type="dxa" w:w="100"/>
+              <w:bottom w:type="dxa" w:w="60"/>
+              <w:right w:type="dxa" w:w="100"/>
+            </w:tcMar>
+          </w:tcPr>
+          <w:p>
+            <w:pPr>
+              <w:spacing w:after="0"/>
+            </w:pPr>
+            <w:r>
+              <w:rPr>
+                <w:sz w:val="19"/>
+                <w:szCs w:val="19"/>
+              </w:rPr>
+              <w:t xml:space="preserve">/challenges, /challenges/{id}/join</w:t>
+            </w:r>
+          </w:p>
+        </w:tc>
+        <w:tc>
+          <w:tcPr>
+            <w:tcW w:type="dxa" w:w="1979"/>
+            <w:tcBorders>
+              <w:top w:val="single" w:color="9FB6CD" w:sz="4"/>
+              <w:left w:val="single" w:color="9FB6CD" w:sz="4"/>
+              <w:bottom w:val="single" w:color="9FB6CD" w:sz="4"/>
+              <w:right w:val="single" w:color="9FB6CD" w:sz="4"/>
+            </w:tcBorders>
+            <w:tcMar>
+              <w:top w:type="dxa" w:w="60"/>
+              <w:left w:type="dxa" w:w="100"/>
+              <w:bottom w:type="dxa" w:w="60"/>
+              <w:right w:type="dxa" w:w="100"/>
+            </w:tcMar>
+          </w:tcPr>
+          <w:p>
+            <w:pPr>
+              <w:spacing w:after="0"/>
+            </w:pPr>
+            <w:r>
+              <w:rPr>
+                <w:sz w:val="19"/>
+                <w:szCs w:val="19"/>
+              </w:rPr>
+              <w:t xml:space="preserve">Goals › Challenges</w:t>
+            </w:r>
+          </w:p>
+        </w:tc>
+      </w:tr>
+      <w:tr>
+        <w:trPr>
+          <w:cantSplit/>
+        </w:trPr>
+        <w:tc>
+          <w:tcPr>
+            <w:tcW w:type="dxa" w:w="741"/>
+            <w:tcBorders>
+              <w:top w:val="single" w:color="9FB6CD" w:sz="4"/>
+              <w:left w:val="single" w:color="9FB6CD" w:sz="4"/>
+              <w:bottom w:val="single" w:color="9FB6CD" w:sz="4"/>
+              <w:right w:val="single" w:color="9FB6CD" w:sz="4"/>
+            </w:tcBorders>
+            <w:tcMar>
+              <w:top w:type="dxa" w:w="60"/>
+              <w:left w:type="dxa" w:w="100"/>
+              <w:bottom w:type="dxa" w:w="60"/>
+              <w:right w:type="dxa" w:w="100"/>
+            </w:tcMar>
+          </w:tcPr>
+          <w:p>
+            <w:pPr>
+              <w:spacing w:after="0"/>
+            </w:pPr>
+            <w:r>
+              <w:rPr>
+                <w:sz w:val="19"/>
+                <w:szCs w:val="19"/>
+              </w:rPr>
+              <w:t xml:space="preserve">UC-34</w:t>
+            </w:r>
+          </w:p>
+        </w:tc>
+        <w:tc>
+          <w:tcPr>
+            <w:tcW w:type="dxa" w:w="2594"/>
+            <w:tcBorders>
+              <w:top w:val="single" w:color="9FB6CD" w:sz="4"/>
+              <w:left w:val="single" w:color="9FB6CD" w:sz="4"/>
+              <w:bottom w:val="single" w:color="9FB6CD" w:sz="4"/>
+              <w:right w:val="single" w:color="9FB6CD" w:sz="4"/>
+            </w:tcBorders>
+            <w:tcMar>
+              <w:top w:type="dxa" w:w="60"/>
+              <w:left w:type="dxa" w:w="100"/>
+              <w:bottom w:type="dxa" w:w="60"/>
+              <w:right w:type="dxa" w:w="100"/>
+            </w:tcMar>
+          </w:tcPr>
+          <w:p>
+            <w:pPr>
+              <w:spacing w:after="0"/>
+            </w:pPr>
+            <w:r>
+              <w:rPr>
+                <w:sz w:val="19"/>
+                <w:szCs w:val="19"/>
+              </w:rPr>
+              <w:t xml:space="preserve">Plan a household budget for a group (F7)</w:t>
+            </w:r>
+          </w:p>
+        </w:tc>
+        <w:tc>
+          <w:tcPr>
+            <w:tcW w:type="dxa" w:w="1359"/>
+            <w:tcBorders>
+              <w:top w:val="single" w:color="9FB6CD" w:sz="4"/>
+              <w:left w:val="single" w:color="9FB6CD" w:sz="4"/>
+              <w:bottom w:val="single" w:color="9FB6CD" w:sz="4"/>
+              <w:right w:val="single" w:color="9FB6CD" w:sz="4"/>
+            </w:tcBorders>
+            <w:tcMar>
+              <w:top w:type="dxa" w:w="60"/>
+              <w:left w:type="dxa" w:w="100"/>
+              <w:bottom w:type="dxa" w:w="60"/>
+              <w:right w:type="dxa" w:w="100"/>
+            </w:tcMar>
+          </w:tcPr>
+          <w:p>
+            <w:pPr>
+              <w:spacing w:after="0"/>
+            </w:pPr>
+            <w:r>
+              <w:rPr>
+                <w:sz w:val="19"/>
+                <w:szCs w:val="19"/>
+              </w:rPr>
+              <w:t xml:space="preserve">Group admin, member</w:t>
+            </w:r>
+          </w:p>
+        </w:tc>
+        <w:tc>
+          <w:tcPr>
+            <w:tcW w:type="dxa" w:w="2965"/>
+            <w:tcBorders>
+              <w:top w:val="single" w:color="9FB6CD" w:sz="4"/>
+              <w:left w:val="single" w:color="9FB6CD" w:sz="4"/>
+              <w:bottom w:val="single" w:color="9FB6CD" w:sz="4"/>
+              <w:right w:val="single" w:color="9FB6CD" w:sz="4"/>
+            </w:tcBorders>
+            <w:tcMar>
+              <w:top w:type="dxa" w:w="60"/>
+              <w:left w:type="dxa" w:w="100"/>
+              <w:bottom w:type="dxa" w:w="60"/>
+              <w:right w:type="dxa" w:w="100"/>
+            </w:tcMar>
+          </w:tcPr>
+          <w:p>
+            <w:pPr>
+              <w:spacing w:after="0"/>
+            </w:pPr>
+            <w:r>
+              <w:rPr>
+                <w:sz w:val="19"/>
+                <w:szCs w:val="19"/>
+              </w:rPr>
+              <w:t xml:space="preserve">/groups/{id}/budget/{month}</w:t>
+            </w:r>
+          </w:p>
+        </w:tc>
+        <w:tc>
+          <w:tcPr>
+            <w:tcW w:type="dxa" w:w="1979"/>
+            <w:tcBorders>
+              <w:top w:val="single" w:color="9FB6CD" w:sz="4"/>
+              <w:left w:val="single" w:color="9FB6CD" w:sz="4"/>
+              <w:bottom w:val="single" w:color="9FB6CD" w:sz="4"/>
+              <w:right w:val="single" w:color="9FB6CD" w:sz="4"/>
+            </w:tcBorders>
+            <w:tcMar>
+              <w:top w:type="dxa" w:w="60"/>
+              <w:left w:type="dxa" w:w="100"/>
+              <w:bottom w:type="dxa" w:w="60"/>
+              <w:right w:type="dxa" w:w="100"/>
+            </w:tcMar>
+          </w:tcPr>
+          <w:p>
+            <w:pPr>
+              <w:spacing w:after="0"/>
+            </w:pPr>
+            <w:r>
+              <w:rPr>
+                <w:sz w:val="19"/>
+                <w:szCs w:val="19"/>
+              </w:rPr>
+              <w:t xml:space="preserve">Group › Household budget</w:t>
+            </w:r>
+          </w:p>
+        </w:tc>
+      </w:tr>
+      <w:tr>
+        <w:trPr>
+          <w:cantSplit/>
+        </w:trPr>
+        <w:tc>
+          <w:tcPr>
+            <w:tcW w:type="dxa" w:w="741"/>
+            <w:tcBorders>
+              <w:top w:val="single" w:color="9FB6CD" w:sz="4"/>
+              <w:left w:val="single" w:color="9FB6CD" w:sz="4"/>
+              <w:bottom w:val="single" w:color="9FB6CD" w:sz="4"/>
+              <w:right w:val="single" w:color="9FB6CD" w:sz="4"/>
+            </w:tcBorders>
+            <w:tcMar>
+              <w:top w:type="dxa" w:w="60"/>
+              <w:left w:type="dxa" w:w="100"/>
+              <w:bottom w:type="dxa" w:w="60"/>
+              <w:right w:type="dxa" w:w="100"/>
+            </w:tcMar>
+          </w:tcPr>
+          <w:p>
+            <w:pPr>
+              <w:spacing w:after="0"/>
+            </w:pPr>
+            <w:r>
+              <w:rPr>
+                <w:sz w:val="19"/>
+                <w:szCs w:val="19"/>
+              </w:rPr>
+              <w:t xml:space="preserve">UC-35</w:t>
+            </w:r>
+          </w:p>
+        </w:tc>
+        <w:tc>
+          <w:tcPr>
+            <w:tcW w:type="dxa" w:w="2594"/>
+            <w:tcBorders>
+              <w:top w:val="single" w:color="9FB6CD" w:sz="4"/>
+              <w:left w:val="single" w:color="9FB6CD" w:sz="4"/>
+              <w:bottom w:val="single" w:color="9FB6CD" w:sz="4"/>
+              <w:right w:val="single" w:color="9FB6CD" w:sz="4"/>
+            </w:tcBorders>
+            <w:tcMar>
+              <w:top w:type="dxa" w:w="60"/>
+              <w:left w:type="dxa" w:w="100"/>
+              <w:bottom w:type="dxa" w:w="60"/>
+              <w:right w:type="dxa" w:w="100"/>
+            </w:tcMar>
+          </w:tcPr>
+          <w:p>
+            <w:pPr>
+              <w:spacing w:after="0"/>
+            </w:pPr>
+            <w:r>
+              <w:rPr>
+                <w:sz w:val="19"/>
+                <w:szCs w:val="19"/>
+              </w:rPr>
+              <w:t xml:space="preserve">See spending in a steady currency and rising prices (F8)</w:t>
+            </w:r>
+          </w:p>
+        </w:tc>
+        <w:tc>
+          <w:tcPr>
+            <w:tcW w:type="dxa" w:w="1359"/>
+            <w:tcBorders>
+              <w:top w:val="single" w:color="9FB6CD" w:sz="4"/>
+              <w:left w:val="single" w:color="9FB6CD" w:sz="4"/>
+              <w:bottom w:val="single" w:color="9FB6CD" w:sz="4"/>
+              <w:right w:val="single" w:color="9FB6CD" w:sz="4"/>
+            </w:tcBorders>
+            <w:tcMar>
+              <w:top w:type="dxa" w:w="60"/>
+              <w:left w:type="dxa" w:w="100"/>
+              <w:bottom w:type="dxa" w:w="60"/>
+              <w:right w:type="dxa" w:w="100"/>
+            </w:tcMar>
+          </w:tcPr>
+          <w:p>
+            <w:pPr>
+              <w:spacing w:after="0"/>
+            </w:pPr>
+            <w:r>
+              <w:rPr>
+                <w:sz w:val="19"/>
+                <w:szCs w:val="19"/>
+              </w:rPr>
+              <w:t xml:space="preserve">Student</w:t>
+            </w:r>
+          </w:p>
+        </w:tc>
+        <w:tc>
+          <w:tcPr>
+            <w:tcW w:type="dxa" w:w="2965"/>
+            <w:tcBorders>
+              <w:top w:val="single" w:color="9FB6CD" w:sz="4"/>
+              <w:left w:val="single" w:color="9FB6CD" w:sz="4"/>
+              <w:bottom w:val="single" w:color="9FB6CD" w:sz="4"/>
+              <w:right w:val="single" w:color="9FB6CD" w:sz="4"/>
+            </w:tcBorders>
+            <w:tcMar>
+              <w:top w:type="dxa" w:w="60"/>
+              <w:left w:type="dxa" w:w="100"/>
+              <w:bottom w:type="dxa" w:w="60"/>
+              <w:right w:type="dxa" w:w="100"/>
+            </w:tcMar>
+          </w:tcPr>
+          <w:p>
+            <w:pPr>
+              <w:spacing w:after="0"/>
+            </w:pPr>
+            <w:r>
+              <w:rPr>
+                <w:sz w:val="19"/>
+                <w:szCs w:val="19"/>
+              </w:rPr>
+              <w:t xml:space="preserve">GET /insights/inflation</w:t>
+            </w:r>
+          </w:p>
+        </w:tc>
+        <w:tc>
+          <w:tcPr>
+            <w:tcW w:type="dxa" w:w="1979"/>
+            <w:tcBorders>
+              <w:top w:val="single" w:color="9FB6CD" w:sz="4"/>
+              <w:left w:val="single" w:color="9FB6CD" w:sz="4"/>
+              <w:bottom w:val="single" w:color="9FB6CD" w:sz="4"/>
+              <w:right w:val="single" w:color="9FB6CD" w:sz="4"/>
+            </w:tcBorders>
+            <w:tcMar>
+              <w:top w:type="dxa" w:w="60"/>
+              <w:left w:type="dxa" w:w="100"/>
+              <w:bottom w:type="dxa" w:w="60"/>
+              <w:right w:type="dxa" w:w="100"/>
+            </w:tcMar>
+          </w:tcPr>
+          <w:p>
+            <w:pPr>
+              <w:spacing w:after="0"/>
+            </w:pPr>
+            <w:r>
+              <w:rPr>
+                <w:sz w:val="19"/>
+                <w:szCs w:val="19"/>
+              </w:rPr>
+              <w:t xml:space="preserve">Budget › Inflation</w:t>
+            </w:r>
+          </w:p>
+        </w:tc>
+      </w:tr>
+      <w:tr>
+        <w:trPr>
+          <w:cantSplit/>
+        </w:trPr>
+        <w:tc>
+          <w:tcPr>
+            <w:tcW w:type="dxa" w:w="741"/>
+            <w:tcBorders>
+              <w:top w:val="single" w:color="9FB6CD" w:sz="4"/>
+              <w:left w:val="single" w:color="9FB6CD" w:sz="4"/>
+              <w:bottom w:val="single" w:color="9FB6CD" w:sz="4"/>
+              <w:right w:val="single" w:color="9FB6CD" w:sz="4"/>
+            </w:tcBorders>
+            <w:tcMar>
+              <w:top w:type="dxa" w:w="60"/>
+              <w:left w:type="dxa" w:w="100"/>
+              <w:bottom w:type="dxa" w:w="60"/>
+              <w:right w:type="dxa" w:w="100"/>
+            </w:tcMar>
+          </w:tcPr>
+          <w:p>
+            <w:pPr>
+              <w:spacing w:after="0"/>
+            </w:pPr>
+            <w:r>
+              <w:rPr>
+                <w:sz w:val="19"/>
+                <w:szCs w:val="19"/>
+              </w:rPr>
+              <w:t xml:space="preserve">UC-36</w:t>
+            </w:r>
+          </w:p>
+        </w:tc>
+        <w:tc>
+          <w:tcPr>
+            <w:tcW w:type="dxa" w:w="2594"/>
+            <w:tcBorders>
+              <w:top w:val="single" w:color="9FB6CD" w:sz="4"/>
+              <w:left w:val="single" w:color="9FB6CD" w:sz="4"/>
+              <w:bottom w:val="single" w:color="9FB6CD" w:sz="4"/>
+              <w:right w:val="single" w:color="9FB6CD" w:sz="4"/>
+            </w:tcBorders>
+            <w:tcMar>
+              <w:top w:type="dxa" w:w="60"/>
+              <w:left w:type="dxa" w:w="100"/>
+              <w:bottom w:type="dxa" w:w="60"/>
+              <w:right w:type="dxa" w:w="100"/>
+            </w:tcMar>
+          </w:tcPr>
+          <w:p>
+            <w:pPr>
+              <w:spacing w:after="0"/>
+            </w:pPr>
+            <w:r>
+              <w:rPr>
+                <w:sz w:val="19"/>
+                <w:szCs w:val="19"/>
+              </w:rPr>
+              <w:t xml:space="preserve">Add an expense by voice or one sentence (F9)</w:t>
+            </w:r>
+          </w:p>
+        </w:tc>
+        <w:tc>
+          <w:tcPr>
+            <w:tcW w:type="dxa" w:w="1359"/>
+            <w:tcBorders>
+              <w:top w:val="single" w:color="9FB6CD" w:sz="4"/>
+              <w:left w:val="single" w:color="9FB6CD" w:sz="4"/>
+              <w:bottom w:val="single" w:color="9FB6CD" w:sz="4"/>
+              <w:right w:val="single" w:color="9FB6CD" w:sz="4"/>
+            </w:tcBorders>
+            <w:tcMar>
+              <w:top w:type="dxa" w:w="60"/>
+              <w:left w:type="dxa" w:w="100"/>
+              <w:bottom w:type="dxa" w:w="60"/>
+              <w:right w:type="dxa" w:w="100"/>
+            </w:tcMar>
+          </w:tcPr>
+          <w:p>
+            <w:pPr>
+              <w:spacing w:after="0"/>
+            </w:pPr>
+            <w:r>
+              <w:rPr>
+                <w:sz w:val="19"/>
+                <w:szCs w:val="19"/>
+              </w:rPr>
+              <w:t xml:space="preserve">Student</w:t>
+            </w:r>
+          </w:p>
+        </w:tc>
+        <w:tc>
+          <w:tcPr>
+            <w:tcW w:type="dxa" w:w="2965"/>
+            <w:tcBorders>
+              <w:top w:val="single" w:color="9FB6CD" w:sz="4"/>
+              <w:left w:val="single" w:color="9FB6CD" w:sz="4"/>
+              <w:bottom w:val="single" w:color="9FB6CD" w:sz="4"/>
+              <w:right w:val="single" w:color="9FB6CD" w:sz="4"/>
+            </w:tcBorders>
+            <w:tcMar>
+              <w:top w:type="dxa" w:w="60"/>
+              <w:left w:type="dxa" w:w="100"/>
+              <w:bottom w:type="dxa" w:w="60"/>
+              <w:right w:type="dxa" w:w="100"/>
+            </w:tcMar>
+          </w:tcPr>
+          <w:p>
+            <w:pPr>
+              <w:spacing w:after="0"/>
+            </w:pPr>
+            <w:r>
+              <w:rPr>
+                <w:sz w:val="19"/>
+                <w:szCs w:val="19"/>
+              </w:rPr>
+              <w:t xml:space="preserve">POST /expenses/quick</w:t>
+            </w:r>
+          </w:p>
+        </w:tc>
+        <w:tc>
+          <w:tcPr>
+            <w:tcW w:type="dxa" w:w="1979"/>
+            <w:tcBorders>
+              <w:top w:val="single" w:color="9FB6CD" w:sz="4"/>
+              <w:left w:val="single" w:color="9FB6CD" w:sz="4"/>
+              <w:bottom w:val="single" w:color="9FB6CD" w:sz="4"/>
+              <w:right w:val="single" w:color="9FB6CD" w:sz="4"/>
+            </w:tcBorders>
+            <w:tcMar>
+              <w:top w:type="dxa" w:w="60"/>
+              <w:left w:type="dxa" w:w="100"/>
+              <w:bottom w:type="dxa" w:w="60"/>
+              <w:right w:type="dxa" w:w="100"/>
+            </w:tcMar>
+          </w:tcPr>
+          <w:p>
+            <w:pPr>
+              <w:spacing w:after="0"/>
+            </w:pPr>
+            <w:r>
+              <w:rPr>
+                <w:sz w:val="19"/>
+                <w:szCs w:val="19"/>
+              </w:rPr>
+              <w:t xml:space="preserve">Expense sheet</w:t>
+            </w:r>
+          </w:p>
+        </w:tc>
+      </w:tr>
+      <w:tr>
+        <w:trPr>
+          <w:cantSplit/>
+        </w:trPr>
+        <w:tc>
+          <w:tcPr>
+            <w:tcW w:type="dxa" w:w="741"/>
+            <w:tcBorders>
+              <w:top w:val="single" w:color="9FB6CD" w:sz="4"/>
+              <w:left w:val="single" w:color="9FB6CD" w:sz="4"/>
+              <w:bottom w:val="single" w:color="9FB6CD" w:sz="4"/>
+              <w:right w:val="single" w:color="9FB6CD" w:sz="4"/>
+            </w:tcBorders>
+            <w:tcMar>
+              <w:top w:type="dxa" w:w="60"/>
+              <w:left w:type="dxa" w:w="100"/>
+              <w:bottom w:type="dxa" w:w="60"/>
+              <w:right w:type="dxa" w:w="100"/>
+            </w:tcMar>
+          </w:tcPr>
+          <w:p>
+            <w:pPr>
+              <w:spacing w:after="0"/>
+            </w:pPr>
+            <w:r>
+              <w:rPr>
+                <w:sz w:val="19"/>
+                <w:szCs w:val="19"/>
+              </w:rPr>
+              <w:t xml:space="preserve">UC-37</w:t>
+            </w:r>
+          </w:p>
+        </w:tc>
+        <w:tc>
+          <w:tcPr>
+            <w:tcW w:type="dxa" w:w="2594"/>
+            <w:tcBorders>
+              <w:top w:val="single" w:color="9FB6CD" w:sz="4"/>
+              <w:left w:val="single" w:color="9FB6CD" w:sz="4"/>
+              <w:bottom w:val="single" w:color="9FB6CD" w:sz="4"/>
+              <w:right w:val="single" w:color="9FB6CD" w:sz="4"/>
+            </w:tcBorders>
+            <w:tcMar>
+              <w:top w:type="dxa" w:w="60"/>
+              <w:left w:type="dxa" w:w="100"/>
+              <w:bottom w:type="dxa" w:w="60"/>
+              <w:right w:type="dxa" w:w="100"/>
+            </w:tcMar>
+          </w:tcPr>
+          <w:p>
+            <w:pPr>
+              <w:spacing w:after="0"/>
+            </w:pPr>
+            <w:r>
+              <w:rPr>
+                <w:sz w:val="19"/>
+                <w:szCs w:val="19"/>
+              </w:rPr>
+              <w:t xml:space="preserve">Scan a receipt (F10)</w:t>
+            </w:r>
+          </w:p>
+        </w:tc>
+        <w:tc>
+          <w:tcPr>
+            <w:tcW w:type="dxa" w:w="1359"/>
+            <w:tcBorders>
+              <w:top w:val="single" w:color="9FB6CD" w:sz="4"/>
+              <w:left w:val="single" w:color="9FB6CD" w:sz="4"/>
+              <w:bottom w:val="single" w:color="9FB6CD" w:sz="4"/>
+              <w:right w:val="single" w:color="9FB6CD" w:sz="4"/>
+            </w:tcBorders>
+            <w:tcMar>
+              <w:top w:type="dxa" w:w="60"/>
+              <w:left w:type="dxa" w:w="100"/>
+              <w:bottom w:type="dxa" w:w="60"/>
+              <w:right w:type="dxa" w:w="100"/>
+            </w:tcMar>
+          </w:tcPr>
+          <w:p>
+            <w:pPr>
+              <w:spacing w:after="0"/>
+            </w:pPr>
+            <w:r>
+              <w:rPr>
+                <w:sz w:val="19"/>
+                <w:szCs w:val="19"/>
+              </w:rPr>
+              <w:t xml:space="preserve">Student</w:t>
+            </w:r>
+          </w:p>
+        </w:tc>
+        <w:tc>
+          <w:tcPr>
+            <w:tcW w:type="dxa" w:w="2965"/>
+            <w:tcBorders>
+              <w:top w:val="single" w:color="9FB6CD" w:sz="4"/>
+              <w:left w:val="single" w:color="9FB6CD" w:sz="4"/>
+              <w:bottom w:val="single" w:color="9FB6CD" w:sz="4"/>
+              <w:right w:val="single" w:color="9FB6CD" w:sz="4"/>
+            </w:tcBorders>
+            <w:tcMar>
+              <w:top w:type="dxa" w:w="60"/>
+              <w:left w:type="dxa" w:w="100"/>
+              <w:bottom w:type="dxa" w:w="60"/>
+              <w:right w:type="dxa" w:w="100"/>
+            </w:tcMar>
+          </w:tcPr>
+          <w:p>
+            <w:pPr>
+              <w:spacing w:after="0"/>
+            </w:pPr>
+            <w:r>
+              <w:rPr>
+                <w:sz w:val="19"/>
+                <w:szCs w:val="19"/>
+              </w:rPr>
+              <w:t xml:space="preserve">POST /expenses/receipt</w:t>
+            </w:r>
+          </w:p>
+        </w:tc>
+        <w:tc>
+          <w:tcPr>
+            <w:tcW w:type="dxa" w:w="1979"/>
+            <w:tcBorders>
+              <w:top w:val="single" w:color="9FB6CD" w:sz="4"/>
+              <w:left w:val="single" w:color="9FB6CD" w:sz="4"/>
+              <w:bottom w:val="single" w:color="9FB6CD" w:sz="4"/>
+              <w:right w:val="single" w:color="9FB6CD" w:sz="4"/>
+            </w:tcBorders>
+            <w:tcMar>
+              <w:top w:type="dxa" w:w="60"/>
+              <w:left w:type="dxa" w:w="100"/>
+              <w:bottom w:type="dxa" w:w="60"/>
+              <w:right w:type="dxa" w:w="100"/>
+            </w:tcMar>
+          </w:tcPr>
+          <w:p>
+            <w:pPr>
+              <w:spacing w:after="0"/>
+            </w:pPr>
+            <w:r>
+              <w:rPr>
+                <w:sz w:val="19"/>
+                <w:szCs w:val="19"/>
+              </w:rPr>
+              <w:t xml:space="preserve">Expense sheet › camera</w:t>
+            </w:r>
+          </w:p>
+        </w:tc>
+      </w:tr>
+      <w:tr>
+        <w:trPr>
+          <w:cantSplit/>
+        </w:trPr>
+        <w:tc>
+          <w:tcPr>
+            <w:tcW w:type="dxa" w:w="741"/>
+            <w:tcBorders>
+              <w:top w:val="single" w:color="9FB6CD" w:sz="4"/>
+              <w:left w:val="single" w:color="9FB6CD" w:sz="4"/>
+              <w:bottom w:val="single" w:color="9FB6CD" w:sz="4"/>
+              <w:right w:val="single" w:color="9FB6CD" w:sz="4"/>
+            </w:tcBorders>
+            <w:tcMar>
+              <w:top w:type="dxa" w:w="60"/>
+              <w:left w:type="dxa" w:w="100"/>
+              <w:bottom w:type="dxa" w:w="60"/>
+              <w:right w:type="dxa" w:w="100"/>
+            </w:tcMar>
+          </w:tcPr>
+          <w:p>
+            <w:pPr>
+              <w:spacing w:after="0"/>
+            </w:pPr>
+            <w:r>
+              <w:rPr>
+                <w:sz w:val="19"/>
+                <w:szCs w:val="19"/>
+              </w:rPr>
+              <w:t xml:space="preserve">UC-38</w:t>
+            </w:r>
+          </w:p>
+        </w:tc>
+        <w:tc>
+          <w:tcPr>
+            <w:tcW w:type="dxa" w:w="2594"/>
+            <w:tcBorders>
+              <w:top w:val="single" w:color="9FB6CD" w:sz="4"/>
+              <w:left w:val="single" w:color="9FB6CD" w:sz="4"/>
+              <w:bottom w:val="single" w:color="9FB6CD" w:sz="4"/>
+              <w:right w:val="single" w:color="9FB6CD" w:sz="4"/>
+            </w:tcBorders>
+            <w:tcMar>
+              <w:top w:type="dxa" w:w="60"/>
+              <w:left w:type="dxa" w:w="100"/>
+              <w:bottom w:type="dxa" w:w="60"/>
+              <w:right w:type="dxa" w:w="100"/>
+            </w:tcMar>
+          </w:tcPr>
+          <w:p>
+            <w:pPr>
+              <w:spacing w:after="0"/>
+            </w:pPr>
+            <w:r>
+              <w:rPr>
+                <w:sz w:val="19"/>
+                <w:szCs w:val="19"/>
+              </w:rPr>
+              <w:t xml:space="preserve">Add expenses offline (F13)</w:t>
+            </w:r>
+          </w:p>
+        </w:tc>
+        <w:tc>
+          <w:tcPr>
+            <w:tcW w:type="dxa" w:w="1359"/>
+            <w:tcBorders>
+              <w:top w:val="single" w:color="9FB6CD" w:sz="4"/>
+              <w:left w:val="single" w:color="9FB6CD" w:sz="4"/>
+              <w:bottom w:val="single" w:color="9FB6CD" w:sz="4"/>
+              <w:right w:val="single" w:color="9FB6CD" w:sz="4"/>
+            </w:tcBorders>
+            <w:tcMar>
+              <w:top w:type="dxa" w:w="60"/>
+              <w:left w:type="dxa" w:w="100"/>
+              <w:bottom w:type="dxa" w:w="60"/>
+              <w:right w:type="dxa" w:w="100"/>
+            </w:tcMar>
+          </w:tcPr>
+          <w:p>
+            <w:pPr>
+              <w:spacing w:after="0"/>
+            </w:pPr>
+            <w:r>
+              <w:rPr>
+                <w:sz w:val="19"/>
+                <w:szCs w:val="19"/>
+              </w:rPr>
+              <w:t xml:space="preserve">Student</w:t>
+            </w:r>
+          </w:p>
+        </w:tc>
+        <w:tc>
+          <w:tcPr>
+            <w:tcW w:type="dxa" w:w="2965"/>
+            <w:tcBorders>
+              <w:top w:val="single" w:color="9FB6CD" w:sz="4"/>
+              <w:left w:val="single" w:color="9FB6CD" w:sz="4"/>
+              <w:bottom w:val="single" w:color="9FB6CD" w:sz="4"/>
+              <w:right w:val="single" w:color="9FB6CD" w:sz="4"/>
+            </w:tcBorders>
+            <w:tcMar>
+              <w:top w:type="dxa" w:w="60"/>
+              <w:left w:type="dxa" w:w="100"/>
+              <w:bottom w:type="dxa" w:w="60"/>
+              <w:right w:type="dxa" w:w="100"/>
+            </w:tcMar>
+          </w:tcPr>
+          <w:p>
+            <w:pPr>
+              <w:spacing w:after="0"/>
+            </w:pPr>
+            <w:r>
+              <w:rPr>
+                <w:sz w:val="19"/>
+                <w:szCs w:val="19"/>
+              </w:rPr>
+              <w:t xml:space="preserve">POST /expenses (client_id)</w:t>
+            </w:r>
+          </w:p>
+        </w:tc>
+        <w:tc>
+          <w:tcPr>
+            <w:tcW w:type="dxa" w:w="1979"/>
+            <w:tcBorders>
+              <w:top w:val="single" w:color="9FB6CD" w:sz="4"/>
+              <w:left w:val="single" w:color="9FB6CD" w:sz="4"/>
+              <w:bottom w:val="single" w:color="9FB6CD" w:sz="4"/>
+              <w:right w:val="single" w:color="9FB6CD" w:sz="4"/>
+            </w:tcBorders>
+            <w:tcMar>
+              <w:top w:type="dxa" w:w="60"/>
+              <w:left w:type="dxa" w:w="100"/>
+              <w:bottom w:type="dxa" w:w="60"/>
+              <w:right w:type="dxa" w:w="100"/>
+            </w:tcMar>
+          </w:tcPr>
+          <w:p>
+            <w:pPr>
+              <w:spacing w:after="0"/>
+            </w:pPr>
+            <w:r>
+              <w:rPr>
+                <w:sz w:val="19"/>
+                <w:szCs w:val="19"/>
+              </w:rPr>
+              <w:t xml:space="preserve">Expense sheet, overview</w:t>
             </w:r>
           </w:p>
         </w:tc>
@@ -16378,7 +18512,7 @@
                 <w:sz w:val="19"/>
                 <w:szCs w:val="19"/>
               </w:rPr>
-              <w:t xml:space="preserve">Groups, members, roles, invites, username requests, expenses, splits, share copies, balances, settlements, activity</w:t>
+              <w:t xml:space="preserve">Groups, members, roles, invites, username requests, expenses, splits, share copies, balances, settlements, activity, household budget</w:t>
             </w:r>
           </w:p>
         </w:tc>
@@ -16407,7 +18541,7 @@
                 <w:sz w:val="19"/>
                 <w:szCs w:val="19"/>
               </w:rPr>
-              <w:t xml:space="preserve">groups, group_members, group_invites, group_requests, group_expenses, group_expense_shares, group_settlements</w:t>
+              <w:t xml:space="preserve">groups, group_members, group_invites, group_requests, group_expenses, group_expense_shares, group_settlements, group_budgets</w:t>
             </w:r>
           </w:p>
         </w:tc>
@@ -16592,6 +18726,558 @@
                 <w:szCs w:val="19"/>
               </w:rPr>
               <w:t xml:space="preserve">push_devices</w:t>
+            </w:r>
+          </w:p>
+        </w:tc>
+      </w:tr>
+      <w:tr>
+        <w:trPr>
+          <w:cantSplit/>
+        </w:trPr>
+        <w:tc>
+          <w:tcPr>
+            <w:tcW w:type="dxa" w:w="1294"/>
+            <w:tcBorders>
+              <w:top w:val="single" w:color="9FB6CD" w:sz="4"/>
+              <w:left w:val="single" w:color="9FB6CD" w:sz="4"/>
+              <w:bottom w:val="single" w:color="9FB6CD" w:sz="4"/>
+              <w:right w:val="single" w:color="9FB6CD" w:sz="4"/>
+            </w:tcBorders>
+            <w:tcMar>
+              <w:top w:type="dxa" w:w="60"/>
+              <w:left w:type="dxa" w:w="100"/>
+              <w:bottom w:type="dxa" w:w="60"/>
+              <w:right w:type="dxa" w:w="100"/>
+            </w:tcMar>
+          </w:tcPr>
+          <w:p>
+            <w:pPr>
+              <w:spacing w:after="0"/>
+            </w:pPr>
+            <w:r>
+              <w:rPr>
+                <w:sz w:val="19"/>
+                <w:szCs w:val="19"/>
+              </w:rPr>
+              <w:t xml:space="preserve">recurring</w:t>
+            </w:r>
+          </w:p>
+        </w:tc>
+        <w:tc>
+          <w:tcPr>
+            <w:tcW w:type="dxa" w:w="4603"/>
+            <w:tcBorders>
+              <w:top w:val="single" w:color="9FB6CD" w:sz="4"/>
+              <w:left w:val="single" w:color="9FB6CD" w:sz="4"/>
+              <w:bottom w:val="single" w:color="9FB6CD" w:sz="4"/>
+              <w:right w:val="single" w:color="9FB6CD" w:sz="4"/>
+            </w:tcBorders>
+            <w:tcMar>
+              <w:top w:type="dxa" w:w="60"/>
+              <w:left w:type="dxa" w:w="100"/>
+              <w:bottom w:type="dxa" w:w="60"/>
+              <w:right w:type="dxa" w:w="100"/>
+            </w:tcMar>
+          </w:tcPr>
+          <w:p>
+            <w:pPr>
+              <w:spacing w:after="0"/>
+            </w:pPr>
+            <w:r>
+              <w:rPr>
+                <w:sz w:val="19"/>
+                <w:szCs w:val="19"/>
+              </w:rPr>
+              <w:t xml:space="preserve">Recurring expense rules, catch-up, reminders; the daily job endpoint</w:t>
+            </w:r>
+          </w:p>
+        </w:tc>
+        <w:tc>
+          <w:tcPr>
+            <w:tcW w:type="dxa" w:w="3741"/>
+            <w:tcBorders>
+              <w:top w:val="single" w:color="9FB6CD" w:sz="4"/>
+              <w:left w:val="single" w:color="9FB6CD" w:sz="4"/>
+              <w:bottom w:val="single" w:color="9FB6CD" w:sz="4"/>
+              <w:right w:val="single" w:color="9FB6CD" w:sz="4"/>
+            </w:tcBorders>
+            <w:tcMar>
+              <w:top w:type="dxa" w:w="60"/>
+              <w:left w:type="dxa" w:w="100"/>
+              <w:bottom w:type="dxa" w:w="60"/>
+              <w:right w:type="dxa" w:w="100"/>
+            </w:tcMar>
+          </w:tcPr>
+          <w:p>
+            <w:pPr>
+              <w:spacing w:after="0"/>
+            </w:pPr>
+            <w:r>
+              <w:rPr>
+                <w:sz w:val="19"/>
+                <w:szCs w:val="19"/>
+              </w:rPr>
+              <w:t xml:space="preserve">recurring_expenses</w:t>
+            </w:r>
+          </w:p>
+        </w:tc>
+      </w:tr>
+      <w:tr>
+        <w:trPr>
+          <w:cantSplit/>
+        </w:trPr>
+        <w:tc>
+          <w:tcPr>
+            <w:tcW w:type="dxa" w:w="1294"/>
+            <w:tcBorders>
+              <w:top w:val="single" w:color="9FB6CD" w:sz="4"/>
+              <w:left w:val="single" w:color="9FB6CD" w:sz="4"/>
+              <w:bottom w:val="single" w:color="9FB6CD" w:sz="4"/>
+              <w:right w:val="single" w:color="9FB6CD" w:sz="4"/>
+            </w:tcBorders>
+            <w:tcMar>
+              <w:top w:type="dxa" w:w="60"/>
+              <w:left w:type="dxa" w:w="100"/>
+              <w:bottom w:type="dxa" w:w="60"/>
+              <w:right w:type="dxa" w:w="100"/>
+            </w:tcMar>
+          </w:tcPr>
+          <w:p>
+            <w:pPr>
+              <w:spacing w:after="0"/>
+            </w:pPr>
+            <w:r>
+              <w:rPr>
+                <w:sz w:val="19"/>
+                <w:szCs w:val="19"/>
+              </w:rPr>
+              <w:t xml:space="preserve">debt</w:t>
+            </w:r>
+          </w:p>
+        </w:tc>
+        <w:tc>
+          <w:tcPr>
+            <w:tcW w:type="dxa" w:w="4603"/>
+            <w:tcBorders>
+              <w:top w:val="single" w:color="9FB6CD" w:sz="4"/>
+              <w:left w:val="single" w:color="9FB6CD" w:sz="4"/>
+              <w:bottom w:val="single" w:color="9FB6CD" w:sz="4"/>
+              <w:right w:val="single" w:color="9FB6CD" w:sz="4"/>
+            </w:tcBorders>
+            <w:tcMar>
+              <w:top w:type="dxa" w:w="60"/>
+              <w:left w:type="dxa" w:w="100"/>
+              <w:bottom w:type="dxa" w:w="60"/>
+              <w:right w:type="dxa" w:w="100"/>
+            </w:tcMar>
+          </w:tcPr>
+          <w:p>
+            <w:pPr>
+              <w:spacing w:after="0"/>
+            </w:pPr>
+            <w:r>
+              <w:rPr>
+                <w:sz w:val="19"/>
+                <w:szCs w:val="19"/>
+              </w:rPr>
+              <w:t xml:space="preserve">Personal debts and payments back, due-day reminders</w:t>
+            </w:r>
+          </w:p>
+        </w:tc>
+        <w:tc>
+          <w:tcPr>
+            <w:tcW w:type="dxa" w:w="3741"/>
+            <w:tcBorders>
+              <w:top w:val="single" w:color="9FB6CD" w:sz="4"/>
+              <w:left w:val="single" w:color="9FB6CD" w:sz="4"/>
+              <w:bottom w:val="single" w:color="9FB6CD" w:sz="4"/>
+              <w:right w:val="single" w:color="9FB6CD" w:sz="4"/>
+            </w:tcBorders>
+            <w:tcMar>
+              <w:top w:type="dxa" w:w="60"/>
+              <w:left w:type="dxa" w:w="100"/>
+              <w:bottom w:type="dxa" w:w="60"/>
+              <w:right w:type="dxa" w:w="100"/>
+            </w:tcMar>
+          </w:tcPr>
+          <w:p>
+            <w:pPr>
+              <w:spacing w:after="0"/>
+            </w:pPr>
+            <w:r>
+              <w:rPr>
+                <w:sz w:val="19"/>
+                <w:szCs w:val="19"/>
+              </w:rPr>
+              <w:t xml:space="preserve">debts, debt_payments</w:t>
+            </w:r>
+          </w:p>
+        </w:tc>
+      </w:tr>
+      <w:tr>
+        <w:trPr>
+          <w:cantSplit/>
+        </w:trPr>
+        <w:tc>
+          <w:tcPr>
+            <w:tcW w:type="dxa" w:w="1294"/>
+            <w:tcBorders>
+              <w:top w:val="single" w:color="9FB6CD" w:sz="4"/>
+              <w:left w:val="single" w:color="9FB6CD" w:sz="4"/>
+              <w:bottom w:val="single" w:color="9FB6CD" w:sz="4"/>
+              <w:right w:val="single" w:color="9FB6CD" w:sz="4"/>
+            </w:tcBorders>
+            <w:tcMar>
+              <w:top w:type="dxa" w:w="60"/>
+              <w:left w:type="dxa" w:w="100"/>
+              <w:bottom w:type="dxa" w:w="60"/>
+              <w:right w:type="dxa" w:w="100"/>
+            </w:tcMar>
+          </w:tcPr>
+          <w:p>
+            <w:pPr>
+              <w:spacing w:after="0"/>
+            </w:pPr>
+            <w:r>
+              <w:rPr>
+                <w:sz w:val="19"/>
+                <w:szCs w:val="19"/>
+              </w:rPr>
+              <w:t xml:space="preserve">income</w:t>
+            </w:r>
+          </w:p>
+        </w:tc>
+        <w:tc>
+          <w:tcPr>
+            <w:tcW w:type="dxa" w:w="4603"/>
+            <w:tcBorders>
+              <w:top w:val="single" w:color="9FB6CD" w:sz="4"/>
+              <w:left w:val="single" w:color="9FB6CD" w:sz="4"/>
+              <w:bottom w:val="single" w:color="9FB6CD" w:sz="4"/>
+              <w:right w:val="single" w:color="9FB6CD" w:sz="4"/>
+            </w:tcBorders>
+            <w:tcMar>
+              <w:top w:type="dxa" w:w="60"/>
+              <w:left w:type="dxa" w:w="100"/>
+              <w:bottom w:type="dxa" w:w="60"/>
+              <w:right w:type="dxa" w:w="100"/>
+            </w:tcMar>
+          </w:tcPr>
+          <w:p>
+            <w:pPr>
+              <w:spacing w:after="0"/>
+            </w:pPr>
+            <w:r>
+              <w:rPr>
+                <w:sz w:val="19"/>
+                <w:szCs w:val="19"/>
+              </w:rPr>
+              <w:t xml:space="preserve">Income by source and type, month totals, net after spending</w:t>
+            </w:r>
+          </w:p>
+        </w:tc>
+        <w:tc>
+          <w:tcPr>
+            <w:tcW w:type="dxa" w:w="3741"/>
+            <w:tcBorders>
+              <w:top w:val="single" w:color="9FB6CD" w:sz="4"/>
+              <w:left w:val="single" w:color="9FB6CD" w:sz="4"/>
+              <w:bottom w:val="single" w:color="9FB6CD" w:sz="4"/>
+              <w:right w:val="single" w:color="9FB6CD" w:sz="4"/>
+            </w:tcBorders>
+            <w:tcMar>
+              <w:top w:type="dxa" w:w="60"/>
+              <w:left w:type="dxa" w:w="100"/>
+              <w:bottom w:type="dxa" w:w="60"/>
+              <w:right w:type="dxa" w:w="100"/>
+            </w:tcMar>
+          </w:tcPr>
+          <w:p>
+            <w:pPr>
+              <w:spacing w:after="0"/>
+            </w:pPr>
+            <w:r>
+              <w:rPr>
+                <w:sz w:val="19"/>
+                <w:szCs w:val="19"/>
+              </w:rPr>
+              <w:t xml:space="preserve">incomes</w:t>
+            </w:r>
+          </w:p>
+        </w:tc>
+      </w:tr>
+      <w:tr>
+        <w:trPr>
+          <w:cantSplit/>
+        </w:trPr>
+        <w:tc>
+          <w:tcPr>
+            <w:tcW w:type="dxa" w:w="1294"/>
+            <w:tcBorders>
+              <w:top w:val="single" w:color="9FB6CD" w:sz="4"/>
+              <w:left w:val="single" w:color="9FB6CD" w:sz="4"/>
+              <w:bottom w:val="single" w:color="9FB6CD" w:sz="4"/>
+              <w:right w:val="single" w:color="9FB6CD" w:sz="4"/>
+            </w:tcBorders>
+            <w:tcMar>
+              <w:top w:type="dxa" w:w="60"/>
+              <w:left w:type="dxa" w:w="100"/>
+              <w:bottom w:type="dxa" w:w="60"/>
+              <w:right w:type="dxa" w:w="100"/>
+            </w:tcMar>
+          </w:tcPr>
+          <w:p>
+            <w:pPr>
+              <w:spacing w:after="0"/>
+            </w:pPr>
+            <w:r>
+              <w:rPr>
+                <w:sz w:val="19"/>
+                <w:szCs w:val="19"/>
+              </w:rPr>
+              <w:t xml:space="preserve">report</w:t>
+            </w:r>
+          </w:p>
+        </w:tc>
+        <w:tc>
+          <w:tcPr>
+            <w:tcW w:type="dxa" w:w="4603"/>
+            <w:tcBorders>
+              <w:top w:val="single" w:color="9FB6CD" w:sz="4"/>
+              <w:left w:val="single" w:color="9FB6CD" w:sz="4"/>
+              <w:bottom w:val="single" w:color="9FB6CD" w:sz="4"/>
+              <w:right w:val="single" w:color="9FB6CD" w:sz="4"/>
+            </w:tcBorders>
+            <w:tcMar>
+              <w:top w:type="dxa" w:w="60"/>
+              <w:left w:type="dxa" w:w="100"/>
+              <w:bottom w:type="dxa" w:w="60"/>
+              <w:right w:type="dxa" w:w="100"/>
+            </w:tcMar>
+          </w:tcPr>
+          <w:p>
+            <w:pPr>
+              <w:spacing w:after="0"/>
+            </w:pPr>
+            <w:r>
+              <w:rPr>
+                <w:sz w:val="19"/>
+                <w:szCs w:val="19"/>
+              </w:rPr>
+              <w:t xml:space="preserve">Month report (Wrapped) and its notification; PDF and Excel files</w:t>
+            </w:r>
+          </w:p>
+        </w:tc>
+        <w:tc>
+          <w:tcPr>
+            <w:tcW w:type="dxa" w:w="3741"/>
+            <w:tcBorders>
+              <w:top w:val="single" w:color="9FB6CD" w:sz="4"/>
+              <w:left w:val="single" w:color="9FB6CD" w:sz="4"/>
+              <w:bottom w:val="single" w:color="9FB6CD" w:sz="4"/>
+              <w:right w:val="single" w:color="9FB6CD" w:sz="4"/>
+            </w:tcBorders>
+            <w:tcMar>
+              <w:top w:type="dxa" w:w="60"/>
+              <w:left w:type="dxa" w:w="100"/>
+              <w:bottom w:type="dxa" w:w="60"/>
+              <w:right w:type="dxa" w:w="100"/>
+            </w:tcMar>
+          </w:tcPr>
+          <w:p>
+            <w:pPr>
+              <w:spacing w:after="0"/>
+            </w:pPr>
+            <w:r>
+              <w:rPr>
+                <w:sz w:val="19"/>
+                <w:szCs w:val="19"/>
+              </w:rPr>
+              <w:t xml:space="preserve">— (reads other domains)</w:t>
+            </w:r>
+          </w:p>
+        </w:tc>
+      </w:tr>
+      <w:tr>
+        <w:trPr>
+          <w:cantSplit/>
+        </w:trPr>
+        <w:tc>
+          <w:tcPr>
+            <w:tcW w:type="dxa" w:w="1294"/>
+            <w:tcBorders>
+              <w:top w:val="single" w:color="9FB6CD" w:sz="4"/>
+              <w:left w:val="single" w:color="9FB6CD" w:sz="4"/>
+              <w:bottom w:val="single" w:color="9FB6CD" w:sz="4"/>
+              <w:right w:val="single" w:color="9FB6CD" w:sz="4"/>
+            </w:tcBorders>
+            <w:tcMar>
+              <w:top w:type="dxa" w:w="60"/>
+              <w:left w:type="dxa" w:w="100"/>
+              <w:bottom w:type="dxa" w:w="60"/>
+              <w:right w:type="dxa" w:w="100"/>
+            </w:tcMar>
+          </w:tcPr>
+          <w:p>
+            <w:pPr>
+              <w:spacing w:after="0"/>
+            </w:pPr>
+            <w:r>
+              <w:rPr>
+                <w:sz w:val="19"/>
+                <w:szCs w:val="19"/>
+              </w:rPr>
+              <w:t xml:space="preserve">challenge</w:t>
+            </w:r>
+          </w:p>
+        </w:tc>
+        <w:tc>
+          <w:tcPr>
+            <w:tcW w:type="dxa" w:w="4603"/>
+            <w:tcBorders>
+              <w:top w:val="single" w:color="9FB6CD" w:sz="4"/>
+              <w:left w:val="single" w:color="9FB6CD" w:sz="4"/>
+              <w:bottom w:val="single" w:color="9FB6CD" w:sz="4"/>
+              <w:right w:val="single" w:color="9FB6CD" w:sz="4"/>
+            </w:tcBorders>
+            <w:tcMar>
+              <w:top w:type="dxa" w:w="60"/>
+              <w:left w:type="dxa" w:w="100"/>
+              <w:bottom w:type="dxa" w:w="60"/>
+              <w:right w:type="dxa" w:w="100"/>
+            </w:tcMar>
+          </w:tcPr>
+          <w:p>
+            <w:pPr>
+              <w:spacing w:after="0"/>
+            </w:pPr>
+            <w:r>
+              <w:rPr>
+                <w:sz w:val="19"/>
+                <w:szCs w:val="19"/>
+              </w:rPr>
+              <w:t xml:space="preserve">Savings challenges, progress from expenses, wins, badges, shared challenges</w:t>
+            </w:r>
+          </w:p>
+        </w:tc>
+        <w:tc>
+          <w:tcPr>
+            <w:tcW w:type="dxa" w:w="3741"/>
+            <w:tcBorders>
+              <w:top w:val="single" w:color="9FB6CD" w:sz="4"/>
+              <w:left w:val="single" w:color="9FB6CD" w:sz="4"/>
+              <w:bottom w:val="single" w:color="9FB6CD" w:sz="4"/>
+              <w:right w:val="single" w:color="9FB6CD" w:sz="4"/>
+            </w:tcBorders>
+            <w:tcMar>
+              <w:top w:type="dxa" w:w="60"/>
+              <w:left w:type="dxa" w:w="100"/>
+              <w:bottom w:type="dxa" w:w="60"/>
+              <w:right w:type="dxa" w:w="100"/>
+            </w:tcMar>
+          </w:tcPr>
+          <w:p>
+            <w:pPr>
+              <w:spacing w:after="0"/>
+            </w:pPr>
+            <w:r>
+              <w:rPr>
+                <w:sz w:val="19"/>
+                <w:szCs w:val="19"/>
+              </w:rPr>
+              <w:t xml:space="preserve">challenges</w:t>
+            </w:r>
+          </w:p>
+        </w:tc>
+      </w:tr>
+      <w:tr>
+        <w:trPr>
+          <w:cantSplit/>
+        </w:trPr>
+        <w:tc>
+          <w:tcPr>
+            <w:tcW w:type="dxa" w:w="1294"/>
+            <w:tcBorders>
+              <w:top w:val="single" w:color="9FB6CD" w:sz="4"/>
+              <w:left w:val="single" w:color="9FB6CD" w:sz="4"/>
+              <w:bottom w:val="single" w:color="9FB6CD" w:sz="4"/>
+              <w:right w:val="single" w:color="9FB6CD" w:sz="4"/>
+            </w:tcBorders>
+            <w:tcMar>
+              <w:top w:type="dxa" w:w="60"/>
+              <w:left w:type="dxa" w:w="100"/>
+              <w:bottom w:type="dxa" w:w="60"/>
+              <w:right w:type="dxa" w:w="100"/>
+            </w:tcMar>
+          </w:tcPr>
+          <w:p>
+            <w:pPr>
+              <w:spacing w:after="0"/>
+            </w:pPr>
+            <w:r>
+              <w:rPr>
+                <w:sz w:val="19"/>
+                <w:szCs w:val="19"/>
+              </w:rPr>
+              <w:t xml:space="preserve">inflation</w:t>
+            </w:r>
+          </w:p>
+        </w:tc>
+        <w:tc>
+          <w:tcPr>
+            <w:tcW w:type="dxa" w:w="4603"/>
+            <w:tcBorders>
+              <w:top w:val="single" w:color="9FB6CD" w:sz="4"/>
+              <w:left w:val="single" w:color="9FB6CD" w:sz="4"/>
+              <w:bottom w:val="single" w:color="9FB6CD" w:sz="4"/>
+              <w:right w:val="single" w:color="9FB6CD" w:sz="4"/>
+            </w:tcBorders>
+            <w:tcMar>
+              <w:top w:type="dxa" w:w="60"/>
+              <w:left w:type="dxa" w:w="100"/>
+              <w:bottom w:type="dxa" w:w="60"/>
+              <w:right w:type="dxa" w:w="100"/>
+            </w:tcMar>
+          </w:tcPr>
+          <w:p>
+            <w:pPr>
+              <w:spacing w:after="0"/>
+            </w:pPr>
+            <w:r>
+              <w:rPr>
+                <w:sz w:val="19"/>
+                <w:szCs w:val="19"/>
+              </w:rPr>
+              <w:t xml:space="preserve">Spending in a steady currency at past rates; price changes of repeated purchases</w:t>
+            </w:r>
+          </w:p>
+        </w:tc>
+        <w:tc>
+          <w:tcPr>
+            <w:tcW w:type="dxa" w:w="3741"/>
+            <w:tcBorders>
+              <w:top w:val="single" w:color="9FB6CD" w:sz="4"/>
+              <w:left w:val="single" w:color="9FB6CD" w:sz="4"/>
+              <w:bottom w:val="single" w:color="9FB6CD" w:sz="4"/>
+              <w:right w:val="single" w:color="9FB6CD" w:sz="4"/>
+            </w:tcBorders>
+            <w:tcMar>
+              <w:top w:type="dxa" w:w="60"/>
+              <w:left w:type="dxa" w:w="100"/>
+              <w:bottom w:type="dxa" w:w="60"/>
+              <w:right w:type="dxa" w:w="100"/>
+            </w:tcMar>
+          </w:tcPr>
+          <w:p>
+            <w:pPr>
+              <w:spacing w:after="0"/>
+            </w:pPr>
+            <w:r>
+              <w:rPr>
+                <w:sz w:val="19"/>
+                <w:szCs w:val="19"/>
+              </w:rPr>
+              <w:t xml:space="preserve">past_rates</w:t>
             </w:r>
           </w:p>
         </w:tc>
@@ -16707,7 +19393,7 @@
         <w:spacing w:after="120"/>
       </w:pPr>
       <w:r>
-        <w:t xml:space="preserve">The 26 tables fall into four groups. A user owns all personal data; a group owns only group data. The single bridge between them is the </w:t>
+        <w:t xml:space="preserve">The 34 tables fall into four groups (the extra features add recurring_expenses, debts, debt_payments, incomes, challenges, group_budgets and past_rates, and expenses gain recurring_id and client_id). A user owns all personal data; a group owns only group data. The single bridge between them is the </w:t>
       </w:r>
       <w:r>
         <w:rPr>
@@ -17939,6 +20625,190 @@
                 <w:szCs w:val="19"/>
               </w:rPr>
               <w:t xml:space="preserve">At most three tips, each with the saving it would bring</w:t>
+            </w:r>
+          </w:p>
+        </w:tc>
+      </w:tr>
+      <w:tr>
+        <w:trPr>
+          <w:cantSplit/>
+        </w:trPr>
+        <w:tc>
+          <w:tcPr>
+            <w:tcW w:type="dxa" w:w="2157"/>
+            <w:tcBorders>
+              <w:top w:val="single" w:color="9FB6CD" w:sz="4"/>
+              <w:left w:val="single" w:color="9FB6CD" w:sz="4"/>
+              <w:bottom w:val="single" w:color="9FB6CD" w:sz="4"/>
+              <w:right w:val="single" w:color="9FB6CD" w:sz="4"/>
+            </w:tcBorders>
+            <w:tcMar>
+              <w:top w:type="dxa" w:w="60"/>
+              <w:left w:type="dxa" w:w="100"/>
+              <w:bottom w:type="dxa" w:w="60"/>
+              <w:right w:type="dxa" w:w="100"/>
+            </w:tcMar>
+          </w:tcPr>
+          <w:p>
+            <w:pPr>
+              <w:spacing w:after="0"/>
+            </w:pPr>
+            <w:r>
+              <w:rPr>
+                <w:sz w:val="19"/>
+                <w:szCs w:val="19"/>
+              </w:rPr>
+              <w:t xml:space="preserve">Quick add (F9)</w:t>
+            </w:r>
+          </w:p>
+        </w:tc>
+        <w:tc>
+          <w:tcPr>
+            <w:tcW w:type="dxa" w:w="3740"/>
+            <w:tcBorders>
+              <w:top w:val="single" w:color="9FB6CD" w:sz="4"/>
+              <w:left w:val="single" w:color="9FB6CD" w:sz="4"/>
+              <w:bottom w:val="single" w:color="9FB6CD" w:sz="4"/>
+              <w:right w:val="single" w:color="9FB6CD" w:sz="4"/>
+            </w:tcBorders>
+            <w:tcMar>
+              <w:top w:type="dxa" w:w="60"/>
+              <w:left w:type="dxa" w:w="100"/>
+              <w:bottom w:type="dxa" w:w="60"/>
+              <w:right w:type="dxa" w:w="100"/>
+            </w:tcMar>
+          </w:tcPr>
+          <w:p>
+            <w:pPr>
+              <w:spacing w:after="0"/>
+            </w:pPr>
+            <w:r>
+              <w:rPr>
+                <w:sz w:val="19"/>
+                <w:szCs w:val="19"/>
+              </w:rPr>
+              <w:t xml:space="preserve">Rules over normalized text: numbers in digits or words, currency words, days (app/ml/quick_add.py)</w:t>
+            </w:r>
+          </w:p>
+        </w:tc>
+        <w:tc>
+          <w:tcPr>
+            <w:tcW w:type="dxa" w:w="3741"/>
+            <w:tcBorders>
+              <w:top w:val="single" w:color="9FB6CD" w:sz="4"/>
+              <w:left w:val="single" w:color="9FB6CD" w:sz="4"/>
+              <w:bottom w:val="single" w:color="9FB6CD" w:sz="4"/>
+              <w:right w:val="single" w:color="9FB6CD" w:sz="4"/>
+            </w:tcBorders>
+            <w:tcMar>
+              <w:top w:type="dxa" w:w="60"/>
+              <w:left w:type="dxa" w:w="100"/>
+              <w:bottom w:type="dxa" w:w="60"/>
+              <w:right w:type="dxa" w:w="100"/>
+            </w:tcMar>
+          </w:tcPr>
+          <w:p>
+            <w:pPr>
+              <w:spacing w:after="0"/>
+            </w:pPr>
+            <w:r>
+              <w:rPr>
+                <w:sz w:val="19"/>
+                <w:szCs w:val="19"/>
+              </w:rPr>
+              <w:t xml:space="preserve">Fills the expense form from one sentence in three languages; never saves</w:t>
+            </w:r>
+          </w:p>
+        </w:tc>
+      </w:tr>
+      <w:tr>
+        <w:trPr>
+          <w:cantSplit/>
+        </w:trPr>
+        <w:tc>
+          <w:tcPr>
+            <w:tcW w:type="dxa" w:w="2157"/>
+            <w:tcBorders>
+              <w:top w:val="single" w:color="9FB6CD" w:sz="4"/>
+              <w:left w:val="single" w:color="9FB6CD" w:sz="4"/>
+              <w:bottom w:val="single" w:color="9FB6CD" w:sz="4"/>
+              <w:right w:val="single" w:color="9FB6CD" w:sz="4"/>
+            </w:tcBorders>
+            <w:tcMar>
+              <w:top w:type="dxa" w:w="60"/>
+              <w:left w:type="dxa" w:w="100"/>
+              <w:bottom w:type="dxa" w:w="60"/>
+              <w:right w:type="dxa" w:w="100"/>
+            </w:tcMar>
+          </w:tcPr>
+          <w:p>
+            <w:pPr>
+              <w:spacing w:after="0"/>
+            </w:pPr>
+            <w:r>
+              <w:rPr>
+                <w:sz w:val="19"/>
+                <w:szCs w:val="19"/>
+              </w:rPr>
+              <w:t xml:space="preserve">Receipt reader (F10)</w:t>
+            </w:r>
+          </w:p>
+        </w:tc>
+        <w:tc>
+          <w:tcPr>
+            <w:tcW w:type="dxa" w:w="3740"/>
+            <w:tcBorders>
+              <w:top w:val="single" w:color="9FB6CD" w:sz="4"/>
+              <w:left w:val="single" w:color="9FB6CD" w:sz="4"/>
+              <w:bottom w:val="single" w:color="9FB6CD" w:sz="4"/>
+              <w:right w:val="single" w:color="9FB6CD" w:sz="4"/>
+            </w:tcBorders>
+            <w:tcMar>
+              <w:top w:type="dxa" w:w="60"/>
+              <w:left w:type="dxa" w:w="100"/>
+              <w:bottom w:type="dxa" w:w="60"/>
+              <w:right w:type="dxa" w:w="100"/>
+            </w:tcMar>
+          </w:tcPr>
+          <w:p>
+            <w:pPr>
+              <w:spacing w:after="0"/>
+            </w:pPr>
+            <w:r>
+              <w:rPr>
+                <w:sz w:val="19"/>
+                <w:szCs w:val="19"/>
+              </w:rPr>
+              <w:t xml:space="preserve">Tesseract OCR (tur+eng+ara) and rules for total, date and shop (app/ml/receipt.py)</w:t>
+            </w:r>
+          </w:p>
+        </w:tc>
+        <w:tc>
+          <w:tcPr>
+            <w:tcW w:type="dxa" w:w="3741"/>
+            <w:tcBorders>
+              <w:top w:val="single" w:color="9FB6CD" w:sz="4"/>
+              <w:left w:val="single" w:color="9FB6CD" w:sz="4"/>
+              <w:bottom w:val="single" w:color="9FB6CD" w:sz="4"/>
+              <w:right w:val="single" w:color="9FB6CD" w:sz="4"/>
+            </w:tcBorders>
+            <w:tcMar>
+              <w:top w:type="dxa" w:w="60"/>
+              <w:left w:type="dxa" w:w="100"/>
+              <w:bottom w:type="dxa" w:w="60"/>
+              <w:right w:type="dxa" w:w="100"/>
+            </w:tcMar>
+          </w:tcPr>
+          <w:p>
+            <w:pPr>
+              <w:spacing w:after="0"/>
+            </w:pPr>
+            <w:r>
+              <w:rPr>
+                <w:sz w:val="19"/>
+                <w:szCs w:val="19"/>
+              </w:rPr>
+              <w:t xml:space="preserve">Fills the form from a photo; the photo is never stored</w:t>
             </w:r>
           </w:p>
         </w:tc>
@@ -18896,7 +21766,91 @@
         <w:spacing w:after="60"/>
       </w:pPr>
       <w:r>
-        <w:t xml:space="preserve">There is no separate worker or queue yet; it will be introduced with the first job that needs retries (for example scheduled budget alerts).</w:t>
+        <w:rPr>
+          <w:b/>
+          <w:bCs/>
+        </w:rPr>
+        <w:t xml:space="preserve">Daily job (F1, F2, F4):</w:t>
+      </w:r>
+      <w:r>
+        <w:t xml:space="preserve"> </w:t>
+      </w:r>
+      <w:r>
+        <w:rPr>
+          <w:rFonts w:ascii="Consolas" w:cs="Consolas" w:eastAsia="Consolas" w:hAnsi="Consolas"/>
+          <w:sz w:val="19"/>
+          <w:szCs w:val="19"/>
+        </w:rPr>
+        <w:t xml:space="preserve">.github/workflows/daily.yml</w:t>
+      </w:r>
+      <w:r>
+        <w:t xml:space="preserve"> calls </w:t>
+      </w:r>
+      <w:r>
+        <w:rPr>
+          <w:rFonts w:ascii="Consolas" w:cs="Consolas" w:eastAsia="Consolas" w:hAnsi="Consolas"/>
+          <w:sz w:val="19"/>
+          <w:szCs w:val="19"/>
+        </w:rPr>
+        <w:t xml:space="preserve">POST /internal/daily</w:t>
+      </w:r>
+      <w:r>
+        <w:t xml:space="preserve"> once a day with a shared secret (</w:t>
+      </w:r>
+      <w:r>
+        <w:rPr>
+          <w:rFonts w:ascii="Consolas" w:cs="Consolas" w:eastAsia="Consolas" w:hAnsi="Consolas"/>
+          <w:sz w:val="19"/>
+          <w:szCs w:val="19"/>
+        </w:rPr>
+        <w:t xml:space="preserve">CRON_SECRET</w:t>
+      </w:r>
+      <w:r>
+        <w:t xml:space="preserve">). It adds recurring expenses that fell due, sends tomorrow's bill reminders, today's debt reminders and the budget alerts they cause, and the month-report notification the day after a budget month ends. Each notification is remembered so it is sent once.</w:t>
+      </w:r>
+    </w:p>
+    <w:p>
+      <w:pPr>
+        <w:pStyle w:val="ListParagraph"/>
+        <w:numPr>
+          <w:ilvl w:val="0"/>
+          <w:numId w:val="2"/>
+        </w:numPr>
+        <w:spacing w:after="60"/>
+      </w:pPr>
+      <w:r>
+        <w:rPr>
+          <w:b/>
+          <w:bCs/>
+        </w:rPr>
+        <w:t xml:space="preserve">Offline adding (F13):</w:t>
+      </w:r>
+      <w:r>
+        <w:t xml:space="preserve"> the clients keep new expenses that got no answer and send them again later; a client-made id (</w:t>
+      </w:r>
+      <w:r>
+        <w:rPr>
+          <w:rFonts w:ascii="Consolas" w:cs="Consolas" w:eastAsia="Consolas" w:hAnsi="Consolas"/>
+          <w:sz w:val="19"/>
+          <w:szCs w:val="19"/>
+        </w:rPr>
+        <w:t xml:space="preserve">expenses.client_id</w:t>
+      </w:r>
+      <w:r>
+        <w:t xml:space="preserve">, unique per user) makes the retry a no-op.</w:t>
+      </w:r>
+    </w:p>
+    <w:p>
+      <w:pPr>
+        <w:pStyle w:val="ListParagraph"/>
+        <w:numPr>
+          <w:ilvl w:val="0"/>
+          <w:numId w:val="2"/>
+        </w:numPr>
+        <w:spacing w:after="60"/>
+      </w:pPr>
+      <w:r>
+        <w:t xml:space="preserve">There is still no separate worker or queue: the daily job is short and idempotent, and a missed day is caught up the next time.</w:t>
       </w:r>
     </w:p>
     <w:p>
@@ -27853,7 +30807,7 @@
         <w:sz w:val="16"/>
         <w:szCs w:val="16"/>
       </w:rPr>
-      <w:t xml:space="preserve">Budget Analysis · Software Architecture Document v2.1</w:t>
+      <w:t xml:space="preserve">Budget Analysis · Software Architecture Document v2.2</w:t>
     </w:r>
   </w:p>
 </w:hdr>

</xml_diff>